<commit_message>
Jadvaldagi qatorlarni yangilash, sanalarni formatlash va yangi funksiyalar qo'shish orqali hujjatlarni yaratish jarayonini takomillashtirish. Order_id yangilandi va qaytganlar hamda yo'qotilganlar bo'limlaridagi ma'lumotlar yangilandi.
</commit_message>
<xml_diff>
--- a/All_Orders_Report.docx
+++ b/All_Orders_Report.docx
@@ -298,7 +298,7 @@
                 <w:szCs w:val="24"/>
                 <w:rFonts w:ascii="Times New Roman" w:cs="Times New Roman" w:eastAsia="Times New Roman" w:hAnsi="Times New Roman"/>
               </w:rPr>
-              <w:t xml:space="preserve">Asomiddin Abduqodirov</w:t>
+              <w:t xml:space="preserve">Komolbek </w:t>
             </w:r>
             <w:r>
               <w:t xml:space="preserve">»</w:t>
@@ -359,7 +359,7 @@
                 <w:szCs w:val="24"/>
                 <w:rFonts w:ascii="Times New Roman" w:cs="Times New Roman" w:eastAsia="Times New Roman" w:hAnsi="Times New Roman"/>
               </w:rPr>
-              <w:t xml:space="preserve">+998 45 666 45 45</w:t>
+              <w:t xml:space="preserve">+998 55 555 55 55</w:t>
             </w:r>
             <w:r>
               <w:t xml:space="preserve"/>
@@ -678,7 +678,7 @@
               <w:jc w:val="center"/>
             </w:pPr>
             <w:r>
-              <w:t xml:space="preserve">40 ta</w:t>
+              <w:t xml:space="preserve">20 ta</w:t>
             </w:r>
           </w:p>
         </w:tc>
@@ -694,7 +694,7 @@
             </w:pPr>
             <w:r>
               <w:t xml:space="preserve">Lesa kres
-20 ta</w:t>
+10 ta</w:t>
             </w:r>
           </w:p>
         </w:tc>
@@ -709,7 +709,7 @@
               <w:jc w:val="center"/>
             </w:pPr>
             <w:r>
-              <w:t xml:space="preserve">26-07-2025</w:t>
+              <w:t xml:space="preserve">29-07-2025</w:t>
             </w:r>
           </w:p>
         </w:tc>
@@ -739,7 +739,7 @@
               <w:jc w:val="center"/>
             </w:pPr>
             <w:r>
-              <w:t xml:space="preserve">200 000 so'm</w:t>
+              <w:t xml:space="preserve">100 000 so'm</w:t>
             </w:r>
           </w:p>
         </w:tc>
@@ -774,7 +774,7 @@
               <w:jc w:val="center"/>
             </w:pPr>
             <w:r>
-              <w:t xml:space="preserve">40 ta</w:t>
+              <w:t xml:space="preserve">20 ta</w:t>
             </w:r>
           </w:p>
         </w:tc>
@@ -800,9 +800,6 @@
               <w:spacing w:before="0" w:after="0"/>
               <w:jc w:val="center"/>
             </w:pPr>
-            <w:r>
-              <w:t xml:space="preserve">salom</w:t>
-            </w:r>
           </w:p>
         </w:tc>
         <w:tc>
@@ -860,7 +857,7 @@
               <w:jc w:val="center"/>
             </w:pPr>
             <w:r>
-              <w:t xml:space="preserve">40 ta</w:t>
+              <w:t xml:space="preserve">20 ta</w:t>
             </w:r>
           </w:p>
         </w:tc>
@@ -886,813 +883,6 @@
               <w:spacing w:before="0" w:after="0"/>
               <w:jc w:val="center"/>
             </w:pPr>
-            <w:r>
-              <w:t xml:space="preserve">salom</w:t>
-            </w:r>
-          </w:p>
-        </w:tc>
-        <w:tc>
-          <w:tcPr>
-            <w:vMerge w:val="continue"/>
-            <w:vAlign w:val="center"/>
-          </w:tcPr>
-          <w:p>
-            <w:pPr>
-              <w:spacing w:before="0" w:after="0"/>
-              <w:jc w:val="center"/>
-            </w:pPr>
-          </w:p>
-        </w:tc>
-        <w:tc>
-          <w:tcPr>
-            <w:vMerge w:val="continue"/>
-            <w:vAlign w:val="center"/>
-          </w:tcPr>
-          <w:p>
-            <w:pPr>
-              <w:spacing w:before="0" w:after="0"/>
-              <w:jc w:val="center"/>
-            </w:pPr>
-          </w:p>
-        </w:tc>
-      </w:tr>
-      <w:tr>
-        <w:tc>
-          <w:p>
-            <w:pPr>
-              <w:spacing w:before="0" w:after="0"/>
-              <w:jc w:val="center"/>
-            </w:pPr>
-            <w:r>
-              <w:t xml:space="preserve">4</w:t>
-            </w:r>
-          </w:p>
-        </w:tc>
-        <w:tc>
-          <w:p>
-            <w:pPr>
-              <w:spacing w:before="0" w:after="0"/>
-              <w:jc w:val="center"/>
-            </w:pPr>
-            <w:r>
-              <w:t xml:space="preserve">Taxta</w:t>
-            </w:r>
-          </w:p>
-        </w:tc>
-        <w:tc>
-          <w:p>
-            <w:pPr>
-              <w:spacing w:before="0" w:after="0"/>
-              <w:jc w:val="center"/>
-            </w:pPr>
-            <w:r>
-              <w:t xml:space="preserve">10 ta</w:t>
-            </w:r>
-          </w:p>
-        </w:tc>
-        <w:tc>
-          <w:tcPr>
-            <w:vMerge w:val="restart"/>
-            <w:vAlign w:val="center"/>
-          </w:tcPr>
-          <w:p>
-            <w:pPr>
-              <w:spacing w:before="0" w:after="0"/>
-              <w:jc w:val="center"/>
-            </w:pPr>
-            <w:r>
-              <w:t xml:space="preserve">Lesa kres
-5 ta</w:t>
-            </w:r>
-          </w:p>
-        </w:tc>
-        <w:tc>
-          <w:tcPr>
-            <w:vMerge w:val="restart"/>
-            <w:vAlign w:val="center"/>
-          </w:tcPr>
-          <w:p>
-            <w:pPr>
-              <w:spacing w:before="0" w:after="0"/>
-              <w:jc w:val="center"/>
-            </w:pPr>
-            <w:r>
-              <w:t xml:space="preserve">26-07-2025</w:t>
-            </w:r>
-          </w:p>
-        </w:tc>
-        <w:tc>
-          <w:tcPr>
-            <w:vMerge w:val="restart"/>
-            <w:vAlign w:val="center"/>
-          </w:tcPr>
-          <w:p>
-            <w:pPr>
-              <w:spacing w:before="0" w:after="0"/>
-              <w:jc w:val="center"/>
-            </w:pPr>
-            <w:r>
-              <w:t xml:space="preserve">10 000 so'm</w:t>
-            </w:r>
-          </w:p>
-        </w:tc>
-        <w:tc>
-          <w:tcPr>
-            <w:vMerge w:val="restart"/>
-            <w:vAlign w:val="center"/>
-          </w:tcPr>
-          <w:p>
-            <w:pPr>
-              <w:spacing w:before="0" w:after="0"/>
-              <w:jc w:val="center"/>
-            </w:pPr>
-            <w:r>
-              <w:t xml:space="preserve">50 000 so'm</w:t>
-            </w:r>
-          </w:p>
-        </w:tc>
-      </w:tr>
-      <w:tr>
-        <w:tc>
-          <w:p>
-            <w:pPr>
-              <w:spacing w:before="0" w:after="0"/>
-              <w:jc w:val="center"/>
-            </w:pPr>
-            <w:r>
-              <w:t xml:space="preserve">5</w:t>
-            </w:r>
-          </w:p>
-        </w:tc>
-        <w:tc>
-          <w:p>
-            <w:pPr>
-              <w:spacing w:before="0" w:after="0"/>
-              <w:jc w:val="center"/>
-            </w:pPr>
-            <w:r>
-              <w:t xml:space="preserve">Oyoqlar</w:t>
-            </w:r>
-          </w:p>
-        </w:tc>
-        <w:tc>
-          <w:p>
-            <w:pPr>
-              <w:spacing w:before="0" w:after="0"/>
-              <w:jc w:val="center"/>
-            </w:pPr>
-            <w:r>
-              <w:t xml:space="preserve">10 ta</w:t>
-            </w:r>
-          </w:p>
-        </w:tc>
-        <w:tc>
-          <w:tcPr>
-            <w:vMerge w:val="continue"/>
-            <w:vAlign w:val="center"/>
-          </w:tcPr>
-          <w:p>
-            <w:pPr>
-              <w:spacing w:before="0" w:after="0"/>
-              <w:jc w:val="center"/>
-            </w:pPr>
-          </w:p>
-        </w:tc>
-        <w:tc>
-          <w:tcPr>
-            <w:vMerge w:val="continue"/>
-            <w:vAlign w:val="center"/>
-          </w:tcPr>
-          <w:p>
-            <w:pPr>
-              <w:spacing w:before="0" w:after="0"/>
-              <w:jc w:val="center"/>
-            </w:pPr>
-            <w:r>
-              <w:t xml:space="preserve">salom</w:t>
-            </w:r>
-          </w:p>
-        </w:tc>
-        <w:tc>
-          <w:tcPr>
-            <w:vMerge w:val="continue"/>
-            <w:vAlign w:val="center"/>
-          </w:tcPr>
-          <w:p>
-            <w:pPr>
-              <w:spacing w:before="0" w:after="0"/>
-              <w:jc w:val="center"/>
-            </w:pPr>
-          </w:p>
-        </w:tc>
-        <w:tc>
-          <w:tcPr>
-            <w:vMerge w:val="continue"/>
-            <w:vAlign w:val="center"/>
-          </w:tcPr>
-          <w:p>
-            <w:pPr>
-              <w:spacing w:before="0" w:after="0"/>
-              <w:jc w:val="center"/>
-            </w:pPr>
-          </w:p>
-        </w:tc>
-      </w:tr>
-      <w:tr>
-        <w:tc>
-          <w:p>
-            <w:pPr>
-              <w:spacing w:before="0" w:after="0"/>
-              <w:jc w:val="center"/>
-            </w:pPr>
-            <w:r>
-              <w:t xml:space="preserve">6</w:t>
-            </w:r>
-          </w:p>
-        </w:tc>
-        <w:tc>
-          <w:p>
-            <w:pPr>
-              <w:spacing w:before="0" w:after="0"/>
-              <w:jc w:val="center"/>
-            </w:pPr>
-            <w:r>
-              <w:t xml:space="preserve">Krestik</w:t>
-            </w:r>
-          </w:p>
-        </w:tc>
-        <w:tc>
-          <w:p>
-            <w:pPr>
-              <w:spacing w:before="0" w:after="0"/>
-              <w:jc w:val="center"/>
-            </w:pPr>
-            <w:r>
-              <w:t xml:space="preserve">10 ta</w:t>
-            </w:r>
-          </w:p>
-        </w:tc>
-        <w:tc>
-          <w:tcPr>
-            <w:vMerge w:val="continue"/>
-            <w:vAlign w:val="center"/>
-          </w:tcPr>
-          <w:p>
-            <w:pPr>
-              <w:spacing w:before="0" w:after="0"/>
-              <w:jc w:val="center"/>
-            </w:pPr>
-          </w:p>
-        </w:tc>
-        <w:tc>
-          <w:tcPr>
-            <w:vMerge w:val="continue"/>
-            <w:vAlign w:val="center"/>
-          </w:tcPr>
-          <w:p>
-            <w:pPr>
-              <w:spacing w:before="0" w:after="0"/>
-              <w:jc w:val="center"/>
-            </w:pPr>
-            <w:r>
-              <w:t xml:space="preserve">salom</w:t>
-            </w:r>
-          </w:p>
-        </w:tc>
-        <w:tc>
-          <w:tcPr>
-            <w:vMerge w:val="continue"/>
-            <w:vAlign w:val="center"/>
-          </w:tcPr>
-          <w:p>
-            <w:pPr>
-              <w:spacing w:before="0" w:after="0"/>
-              <w:jc w:val="center"/>
-            </w:pPr>
-          </w:p>
-        </w:tc>
-        <w:tc>
-          <w:tcPr>
-            <w:vMerge w:val="continue"/>
-            <w:vAlign w:val="center"/>
-          </w:tcPr>
-          <w:p>
-            <w:pPr>
-              <w:spacing w:before="0" w:after="0"/>
-              <w:jc w:val="center"/>
-            </w:pPr>
-          </w:p>
-        </w:tc>
-      </w:tr>
-      <w:tr>
-        <w:tc>
-          <w:p>
-            <w:pPr>
-              <w:spacing w:before="0" w:after="0"/>
-              <w:jc w:val="center"/>
-            </w:pPr>
-            <w:r>
-              <w:t xml:space="preserve">7</w:t>
-            </w:r>
-          </w:p>
-        </w:tc>
-        <w:tc>
-          <w:p>
-            <w:pPr>
-              <w:spacing w:before="0" w:after="0"/>
-              <w:jc w:val="center"/>
-            </w:pPr>
-            <w:r>
-              <w:t xml:space="preserve">Taxta</w:t>
-            </w:r>
-          </w:p>
-        </w:tc>
-        <w:tc>
-          <w:p>
-            <w:pPr>
-              <w:spacing w:before="0" w:after="0"/>
-              <w:jc w:val="center"/>
-            </w:pPr>
-            <w:r>
-              <w:t xml:space="preserve">10 ta</w:t>
-            </w:r>
-          </w:p>
-        </w:tc>
-        <w:tc>
-          <w:tcPr>
-            <w:vMerge w:val="restart"/>
-            <w:vAlign w:val="center"/>
-          </w:tcPr>
-          <w:p>
-            <w:pPr>
-              <w:spacing w:before="0" w:after="0"/>
-              <w:jc w:val="center"/>
-            </w:pPr>
-            <w:r>
-              <w:t xml:space="preserve">Lesa kres
-5 ta</w:t>
-            </w:r>
-          </w:p>
-        </w:tc>
-        <w:tc>
-          <w:tcPr>
-            <w:vMerge w:val="restart"/>
-            <w:vAlign w:val="center"/>
-          </w:tcPr>
-          <w:p>
-            <w:pPr>
-              <w:spacing w:before="0" w:after="0"/>
-              <w:jc w:val="center"/>
-            </w:pPr>
-            <w:r>
-              <w:t xml:space="preserve">26-07-2025</w:t>
-            </w:r>
-          </w:p>
-        </w:tc>
-        <w:tc>
-          <w:tcPr>
-            <w:vMerge w:val="restart"/>
-            <w:vAlign w:val="center"/>
-          </w:tcPr>
-          <w:p>
-            <w:pPr>
-              <w:spacing w:before="0" w:after="0"/>
-              <w:jc w:val="center"/>
-            </w:pPr>
-            <w:r>
-              <w:t xml:space="preserve">9 000 so'm</w:t>
-            </w:r>
-          </w:p>
-        </w:tc>
-        <w:tc>
-          <w:tcPr>
-            <w:vMerge w:val="restart"/>
-            <w:vAlign w:val="center"/>
-          </w:tcPr>
-          <w:p>
-            <w:pPr>
-              <w:spacing w:before="0" w:after="0"/>
-              <w:jc w:val="center"/>
-            </w:pPr>
-            <w:r>
-              <w:t xml:space="preserve">45 000 so'm</w:t>
-            </w:r>
-          </w:p>
-        </w:tc>
-      </w:tr>
-      <w:tr>
-        <w:tc>
-          <w:p>
-            <w:pPr>
-              <w:spacing w:before="0" w:after="0"/>
-              <w:jc w:val="center"/>
-            </w:pPr>
-            <w:r>
-              <w:t xml:space="preserve">8</w:t>
-            </w:r>
-          </w:p>
-        </w:tc>
-        <w:tc>
-          <w:p>
-            <w:pPr>
-              <w:spacing w:before="0" w:after="0"/>
-              <w:jc w:val="center"/>
-            </w:pPr>
-            <w:r>
-              <w:t xml:space="preserve">Oyoqlar</w:t>
-            </w:r>
-          </w:p>
-        </w:tc>
-        <w:tc>
-          <w:p>
-            <w:pPr>
-              <w:spacing w:before="0" w:after="0"/>
-              <w:jc w:val="center"/>
-            </w:pPr>
-            <w:r>
-              <w:t xml:space="preserve">10 ta</w:t>
-            </w:r>
-          </w:p>
-        </w:tc>
-        <w:tc>
-          <w:tcPr>
-            <w:vMerge w:val="continue"/>
-            <w:vAlign w:val="center"/>
-          </w:tcPr>
-          <w:p>
-            <w:pPr>
-              <w:spacing w:before="0" w:after="0"/>
-              <w:jc w:val="center"/>
-            </w:pPr>
-          </w:p>
-        </w:tc>
-        <w:tc>
-          <w:tcPr>
-            <w:vMerge w:val="continue"/>
-            <w:vAlign w:val="center"/>
-          </w:tcPr>
-          <w:p>
-            <w:pPr>
-              <w:spacing w:before="0" w:after="0"/>
-              <w:jc w:val="center"/>
-            </w:pPr>
-            <w:r>
-              <w:t xml:space="preserve">salom</w:t>
-            </w:r>
-          </w:p>
-        </w:tc>
-        <w:tc>
-          <w:tcPr>
-            <w:vMerge w:val="continue"/>
-            <w:vAlign w:val="center"/>
-          </w:tcPr>
-          <w:p>
-            <w:pPr>
-              <w:spacing w:before="0" w:after="0"/>
-              <w:jc w:val="center"/>
-            </w:pPr>
-          </w:p>
-        </w:tc>
-        <w:tc>
-          <w:tcPr>
-            <w:vMerge w:val="continue"/>
-            <w:vAlign w:val="center"/>
-          </w:tcPr>
-          <w:p>
-            <w:pPr>
-              <w:spacing w:before="0" w:after="0"/>
-              <w:jc w:val="center"/>
-            </w:pPr>
-          </w:p>
-        </w:tc>
-      </w:tr>
-      <w:tr>
-        <w:tc>
-          <w:p>
-            <w:pPr>
-              <w:spacing w:before="0" w:after="0"/>
-              <w:jc w:val="center"/>
-            </w:pPr>
-            <w:r>
-              <w:t xml:space="preserve">9</w:t>
-            </w:r>
-          </w:p>
-        </w:tc>
-        <w:tc>
-          <w:p>
-            <w:pPr>
-              <w:spacing w:before="0" w:after="0"/>
-              <w:jc w:val="center"/>
-            </w:pPr>
-            <w:r>
-              <w:t xml:space="preserve">Krestik</w:t>
-            </w:r>
-          </w:p>
-        </w:tc>
-        <w:tc>
-          <w:p>
-            <w:pPr>
-              <w:spacing w:before="0" w:after="0"/>
-              <w:jc w:val="center"/>
-            </w:pPr>
-            <w:r>
-              <w:t xml:space="preserve">10 ta</w:t>
-            </w:r>
-          </w:p>
-        </w:tc>
-        <w:tc>
-          <w:tcPr>
-            <w:vMerge w:val="continue"/>
-            <w:vAlign w:val="center"/>
-          </w:tcPr>
-          <w:p>
-            <w:pPr>
-              <w:spacing w:before="0" w:after="0"/>
-              <w:jc w:val="center"/>
-            </w:pPr>
-          </w:p>
-        </w:tc>
-        <w:tc>
-          <w:tcPr>
-            <w:vMerge w:val="continue"/>
-            <w:vAlign w:val="center"/>
-          </w:tcPr>
-          <w:p>
-            <w:pPr>
-              <w:spacing w:before="0" w:after="0"/>
-              <w:jc w:val="center"/>
-            </w:pPr>
-            <w:r>
-              <w:t xml:space="preserve">salom</w:t>
-            </w:r>
-          </w:p>
-        </w:tc>
-        <w:tc>
-          <w:tcPr>
-            <w:vMerge w:val="continue"/>
-            <w:vAlign w:val="center"/>
-          </w:tcPr>
-          <w:p>
-            <w:pPr>
-              <w:spacing w:before="0" w:after="0"/>
-              <w:jc w:val="center"/>
-            </w:pPr>
-          </w:p>
-        </w:tc>
-        <w:tc>
-          <w:tcPr>
-            <w:vMerge w:val="continue"/>
-            <w:vAlign w:val="center"/>
-          </w:tcPr>
-          <w:p>
-            <w:pPr>
-              <w:spacing w:before="0" w:after="0"/>
-              <w:jc w:val="center"/>
-            </w:pPr>
-          </w:p>
-        </w:tc>
-      </w:tr>
-      <w:tr>
-        <w:tc>
-          <w:p>
-            <w:pPr>
-              <w:spacing w:before="0" w:after="0"/>
-              <w:jc w:val="center"/>
-            </w:pPr>
-            <w:r>
-              <w:t xml:space="preserve">10</w:t>
-            </w:r>
-          </w:p>
-        </w:tc>
-        <w:tc>
-          <w:p>
-            <w:pPr>
-              <w:spacing w:before="0" w:after="0"/>
-              <w:jc w:val="center"/>
-            </w:pPr>
-            <w:r>
-              <w:t xml:space="preserve">Taxta</w:t>
-            </w:r>
-          </w:p>
-        </w:tc>
-        <w:tc>
-          <w:p>
-            <w:pPr>
-              <w:spacing w:before="0" w:after="0"/>
-              <w:jc w:val="center"/>
-            </w:pPr>
-            <w:r>
-              <w:t xml:space="preserve">10 ta</w:t>
-            </w:r>
-          </w:p>
-        </w:tc>
-        <w:tc>
-          <w:tcPr>
-            <w:vMerge w:val="restart"/>
-            <w:vAlign w:val="center"/>
-          </w:tcPr>
-          <w:p>
-            <w:pPr>
-              <w:spacing w:before="0" w:after="0"/>
-              <w:jc w:val="center"/>
-            </w:pPr>
-            <w:r>
-              <w:t xml:space="preserve">Lesa kres
-5 ta</w:t>
-            </w:r>
-          </w:p>
-        </w:tc>
-        <w:tc>
-          <w:tcPr>
-            <w:vMerge w:val="restart"/>
-            <w:vAlign w:val="center"/>
-          </w:tcPr>
-          <w:p>
-            <w:pPr>
-              <w:spacing w:before="0" w:after="0"/>
-              <w:jc w:val="center"/>
-            </w:pPr>
-            <w:r>
-              <w:t xml:space="preserve">26-07-2025</w:t>
-            </w:r>
-          </w:p>
-        </w:tc>
-        <w:tc>
-          <w:tcPr>
-            <w:vMerge w:val="restart"/>
-            <w:vAlign w:val="center"/>
-          </w:tcPr>
-          <w:p>
-            <w:pPr>
-              <w:spacing w:before="0" w:after="0"/>
-              <w:jc w:val="center"/>
-            </w:pPr>
-            <w:r>
-              <w:t xml:space="preserve">10 000 so'm</w:t>
-            </w:r>
-          </w:p>
-        </w:tc>
-        <w:tc>
-          <w:tcPr>
-            <w:vMerge w:val="restart"/>
-            <w:vAlign w:val="center"/>
-          </w:tcPr>
-          <w:p>
-            <w:pPr>
-              <w:spacing w:before="0" w:after="0"/>
-              <w:jc w:val="center"/>
-            </w:pPr>
-            <w:r>
-              <w:t xml:space="preserve">50 000 so'm</w:t>
-            </w:r>
-          </w:p>
-        </w:tc>
-      </w:tr>
-      <w:tr>
-        <w:tc>
-          <w:p>
-            <w:pPr>
-              <w:spacing w:before="0" w:after="0"/>
-              <w:jc w:val="center"/>
-            </w:pPr>
-            <w:r>
-              <w:t xml:space="preserve">11</w:t>
-            </w:r>
-          </w:p>
-        </w:tc>
-        <w:tc>
-          <w:p>
-            <w:pPr>
-              <w:spacing w:before="0" w:after="0"/>
-              <w:jc w:val="center"/>
-            </w:pPr>
-            <w:r>
-              <w:t xml:space="preserve">Oyoqlar</w:t>
-            </w:r>
-          </w:p>
-        </w:tc>
-        <w:tc>
-          <w:p>
-            <w:pPr>
-              <w:spacing w:before="0" w:after="0"/>
-              <w:jc w:val="center"/>
-            </w:pPr>
-            <w:r>
-              <w:t xml:space="preserve">10 ta</w:t>
-            </w:r>
-          </w:p>
-        </w:tc>
-        <w:tc>
-          <w:tcPr>
-            <w:vMerge w:val="continue"/>
-            <w:vAlign w:val="center"/>
-          </w:tcPr>
-          <w:p>
-            <w:pPr>
-              <w:spacing w:before="0" w:after="0"/>
-              <w:jc w:val="center"/>
-            </w:pPr>
-          </w:p>
-        </w:tc>
-        <w:tc>
-          <w:tcPr>
-            <w:vMerge w:val="continue"/>
-            <w:vAlign w:val="center"/>
-          </w:tcPr>
-          <w:p>
-            <w:pPr>
-              <w:spacing w:before="0" w:after="0"/>
-              <w:jc w:val="center"/>
-            </w:pPr>
-            <w:r>
-              <w:t xml:space="preserve">salom</w:t>
-            </w:r>
-          </w:p>
-        </w:tc>
-        <w:tc>
-          <w:tcPr>
-            <w:vMerge w:val="continue"/>
-            <w:vAlign w:val="center"/>
-          </w:tcPr>
-          <w:p>
-            <w:pPr>
-              <w:spacing w:before="0" w:after="0"/>
-              <w:jc w:val="center"/>
-            </w:pPr>
-          </w:p>
-        </w:tc>
-        <w:tc>
-          <w:tcPr>
-            <w:vMerge w:val="continue"/>
-            <w:vAlign w:val="center"/>
-          </w:tcPr>
-          <w:p>
-            <w:pPr>
-              <w:spacing w:before="0" w:after="0"/>
-              <w:jc w:val="center"/>
-            </w:pPr>
-          </w:p>
-        </w:tc>
-      </w:tr>
-      <w:tr>
-        <w:tc>
-          <w:p>
-            <w:pPr>
-              <w:spacing w:before="0" w:after="0"/>
-              <w:jc w:val="center"/>
-            </w:pPr>
-            <w:r>
-              <w:t xml:space="preserve">12</w:t>
-            </w:r>
-          </w:p>
-        </w:tc>
-        <w:tc>
-          <w:p>
-            <w:pPr>
-              <w:spacing w:before="0" w:after="0"/>
-              <w:jc w:val="center"/>
-            </w:pPr>
-            <w:r>
-              <w:t xml:space="preserve">Krestik</w:t>
-            </w:r>
-          </w:p>
-        </w:tc>
-        <w:tc>
-          <w:p>
-            <w:pPr>
-              <w:spacing w:before="0" w:after="0"/>
-              <w:jc w:val="center"/>
-            </w:pPr>
-            <w:r>
-              <w:t xml:space="preserve">10 ta</w:t>
-            </w:r>
-          </w:p>
-        </w:tc>
-        <w:tc>
-          <w:tcPr>
-            <w:vMerge w:val="continue"/>
-            <w:vAlign w:val="center"/>
-          </w:tcPr>
-          <w:p>
-            <w:pPr>
-              <w:spacing w:before="0" w:after="0"/>
-              <w:jc w:val="center"/>
-            </w:pPr>
-          </w:p>
-        </w:tc>
-        <w:tc>
-          <w:tcPr>
-            <w:vMerge w:val="continue"/>
-            <w:vAlign w:val="center"/>
-          </w:tcPr>
-          <w:p>
-            <w:pPr>
-              <w:spacing w:before="0" w:after="0"/>
-              <w:jc w:val="center"/>
-            </w:pPr>
-            <w:r>
-              <w:t xml:space="preserve">salom</w:t>
-            </w:r>
           </w:p>
         </w:tc>
         <w:tc>
@@ -1986,7 +1176,7 @@
               <w:jc w:val="center"/>
             </w:pPr>
             <w:r>
-              <w:t xml:space="preserve">10 ta</w:t>
+              <w:t xml:space="preserve">2 ta</w:t>
             </w:r>
           </w:p>
         </w:tc>
@@ -2002,7 +1192,7 @@
             </w:pPr>
             <w:r>
               <w:t xml:space="preserve">Lesa kres
-20 ta</w:t>
+1 ta</w:t>
             </w:r>
           </w:p>
         </w:tc>
@@ -2017,7 +1207,7 @@
               <w:jc w:val="center"/>
             </w:pPr>
             <w:r>
-              <w:t xml:space="preserve">31-07-2025</w:t>
+              <w:t xml:space="preserve">30-07-2025</w:t>
             </w:r>
           </w:p>
         </w:tc>
@@ -2032,7 +1222,7 @@
               <w:jc w:val="center"/>
             </w:pPr>
             <w:r>
-              <w:t xml:space="preserve">6 kun</w:t>
+              <w:t xml:space="preserve">2 kun</w:t>
             </w:r>
           </w:p>
         </w:tc>
@@ -2047,7 +1237,7 @@
               <w:jc w:val="center"/>
             </w:pPr>
             <w:r>
-              <w:t xml:space="preserve">300 000 so'm</w:t>
+              <w:t xml:space="preserve">0 so'm</w:t>
             </w:r>
           </w:p>
         </w:tc>
@@ -2082,7 +1272,7 @@
               <w:jc w:val="center"/>
             </w:pPr>
             <w:r>
-              <w:t xml:space="preserve">10 ta</w:t>
+              <w:t xml:space="preserve">2 ta</w:t>
             </w:r>
           </w:p>
         </w:tc>
@@ -2165,7 +1355,7 @@
               <w:jc w:val="center"/>
             </w:pPr>
             <w:r>
-              <w:t xml:space="preserve">10 ta</w:t>
+              <w:t xml:space="preserve">2 ta</w:t>
             </w:r>
           </w:p>
         </w:tc>
@@ -2432,25 +1622,28 @@
             <w:pPr>
               <w:jc w:val="center"/>
             </w:pPr>
-          </w:p>
-        </w:tc>
-        <w:tc>
-          <w:p>
-            <w:pPr>
-              <w:jc w:val="center"/>
-            </w:pPr>
-            <w:r>
-              <w:t xml:space="preserve">0 so'm</w:t>
-            </w:r>
-          </w:p>
-        </w:tc>
-        <w:tc>
-          <w:p>
-            <w:pPr>
-              <w:jc w:val="center"/>
-            </w:pPr>
-            <w:r>
-              <w:t xml:space="preserve">не число so'm</w:t>
+            <w:r>
+              <w:t xml:space="preserve">18 ta</w:t>
+            </w:r>
+          </w:p>
+        </w:tc>
+        <w:tc>
+          <w:p>
+            <w:pPr>
+              <w:jc w:val="center"/>
+            </w:pPr>
+            <w:r>
+              <w:t xml:space="preserve">75 000 so'm</w:t>
+            </w:r>
+          </w:p>
+        </w:tc>
+        <w:tc>
+          <w:p>
+            <w:pPr>
+              <w:jc w:val="center"/>
+            </w:pPr>
+            <w:r>
+              <w:t xml:space="preserve">1 350 000 so'm</w:t>
             </w:r>
           </w:p>
         </w:tc>
@@ -2481,25 +1674,28 @@
             <w:pPr>
               <w:jc w:val="center"/>
             </w:pPr>
-          </w:p>
-        </w:tc>
-        <w:tc>
-          <w:p>
-            <w:pPr>
-              <w:jc w:val="center"/>
-            </w:pPr>
-            <w:r>
-              <w:t xml:space="preserve">0 so'm</w:t>
-            </w:r>
-          </w:p>
-        </w:tc>
-        <w:tc>
-          <w:p>
-            <w:pPr>
-              <w:jc w:val="center"/>
-            </w:pPr>
-            <w:r>
-              <w:t xml:space="preserve">не число so'm</w:t>
+            <w:r>
+              <w:t xml:space="preserve">18 ta</w:t>
+            </w:r>
+          </w:p>
+        </w:tc>
+        <w:tc>
+          <w:p>
+            <w:pPr>
+              <w:jc w:val="center"/>
+            </w:pPr>
+            <w:r>
+              <w:t xml:space="preserve">95 000 so'm</w:t>
+            </w:r>
+          </w:p>
+        </w:tc>
+        <w:tc>
+          <w:p>
+            <w:pPr>
+              <w:jc w:val="center"/>
+            </w:pPr>
+            <w:r>
+              <w:t xml:space="preserve">1 710 000 so'm</w:t>
             </w:r>
           </w:p>
         </w:tc>
@@ -2530,466 +1726,28 @@
             <w:pPr>
               <w:jc w:val="center"/>
             </w:pPr>
-          </w:p>
-        </w:tc>
-        <w:tc>
-          <w:p>
-            <w:pPr>
-              <w:jc w:val="center"/>
-            </w:pPr>
-            <w:r>
-              <w:t xml:space="preserve">0 so'm</w:t>
-            </w:r>
-          </w:p>
-        </w:tc>
-        <w:tc>
-          <w:p>
-            <w:pPr>
-              <w:jc w:val="center"/>
-            </w:pPr>
-            <w:r>
-              <w:t xml:space="preserve">не число so'm</w:t>
-            </w:r>
-          </w:p>
-        </w:tc>
-      </w:tr>
-      <w:tr>
-        <w:tc>
-          <w:p>
-            <w:pPr>
-              <w:jc w:val="center"/>
-            </w:pPr>
-            <w:r>
-              <w:t xml:space="preserve">4</w:t>
-            </w:r>
-          </w:p>
-        </w:tc>
-        <w:tc>
-          <w:p>
-            <w:pPr>
-              <w:jc w:val="center"/>
-            </w:pPr>
-            <w:r>
-              <w:t xml:space="preserve">Taxta</w:t>
-            </w:r>
-          </w:p>
-        </w:tc>
-        <w:tc>
-          <w:p>
-            <w:pPr>
-              <w:jc w:val="center"/>
-            </w:pPr>
-          </w:p>
-        </w:tc>
-        <w:tc>
-          <w:p>
-            <w:pPr>
-              <w:jc w:val="center"/>
-            </w:pPr>
-            <w:r>
-              <w:t xml:space="preserve">0 so'm</w:t>
-            </w:r>
-          </w:p>
-        </w:tc>
-        <w:tc>
-          <w:p>
-            <w:pPr>
-              <w:jc w:val="center"/>
-            </w:pPr>
-            <w:r>
-              <w:t xml:space="preserve">не число so'm</w:t>
-            </w:r>
-          </w:p>
-        </w:tc>
-      </w:tr>
-      <w:tr>
-        <w:tc>
-          <w:p>
-            <w:pPr>
-              <w:jc w:val="center"/>
-            </w:pPr>
-            <w:r>
-              <w:t xml:space="preserve">5</w:t>
-            </w:r>
-          </w:p>
-        </w:tc>
-        <w:tc>
-          <w:p>
-            <w:pPr>
-              <w:jc w:val="center"/>
-            </w:pPr>
-            <w:r>
-              <w:t xml:space="preserve">Oyoqlar</w:t>
-            </w:r>
-          </w:p>
-        </w:tc>
-        <w:tc>
-          <w:p>
-            <w:pPr>
-              <w:jc w:val="center"/>
-            </w:pPr>
-          </w:p>
-        </w:tc>
-        <w:tc>
-          <w:p>
-            <w:pPr>
-              <w:jc w:val="center"/>
-            </w:pPr>
-            <w:r>
-              <w:t xml:space="preserve">0 so'm</w:t>
-            </w:r>
-          </w:p>
-        </w:tc>
-        <w:tc>
-          <w:p>
-            <w:pPr>
-              <w:jc w:val="center"/>
-            </w:pPr>
-            <w:r>
-              <w:t xml:space="preserve">не число so'm</w:t>
-            </w:r>
-          </w:p>
-        </w:tc>
-      </w:tr>
-      <w:tr>
-        <w:tc>
-          <w:p>
-            <w:pPr>
-              <w:jc w:val="center"/>
-            </w:pPr>
-            <w:r>
-              <w:t xml:space="preserve">6</w:t>
-            </w:r>
-          </w:p>
-        </w:tc>
-        <w:tc>
-          <w:p>
-            <w:pPr>
-              <w:jc w:val="center"/>
-            </w:pPr>
-            <w:r>
-              <w:t xml:space="preserve">Krestik</w:t>
-            </w:r>
-          </w:p>
-        </w:tc>
-        <w:tc>
-          <w:p>
-            <w:pPr>
-              <w:jc w:val="center"/>
-            </w:pPr>
-          </w:p>
-        </w:tc>
-        <w:tc>
-          <w:p>
-            <w:pPr>
-              <w:jc w:val="center"/>
-            </w:pPr>
-            <w:r>
-              <w:t xml:space="preserve">0 so'm</w:t>
-            </w:r>
-          </w:p>
-        </w:tc>
-        <w:tc>
-          <w:p>
-            <w:pPr>
-              <w:jc w:val="center"/>
-            </w:pPr>
-            <w:r>
-              <w:t xml:space="preserve">не число so'm</w:t>
-            </w:r>
-          </w:p>
-        </w:tc>
-      </w:tr>
-      <w:tr>
-        <w:tc>
-          <w:p>
-            <w:pPr>
-              <w:jc w:val="center"/>
-            </w:pPr>
-            <w:r>
-              <w:t xml:space="preserve">7</w:t>
-            </w:r>
-          </w:p>
-        </w:tc>
-        <w:tc>
-          <w:p>
-            <w:pPr>
-              <w:jc w:val="center"/>
-            </w:pPr>
-            <w:r>
-              <w:t xml:space="preserve">Taxta</w:t>
-            </w:r>
-          </w:p>
-        </w:tc>
-        <w:tc>
-          <w:p>
-            <w:pPr>
-              <w:jc w:val="center"/>
-            </w:pPr>
-          </w:p>
-        </w:tc>
-        <w:tc>
-          <w:p>
-            <w:pPr>
-              <w:jc w:val="center"/>
-            </w:pPr>
-            <w:r>
-              <w:t xml:space="preserve">0 so'm</w:t>
-            </w:r>
-          </w:p>
-        </w:tc>
-        <w:tc>
-          <w:p>
-            <w:pPr>
-              <w:jc w:val="center"/>
-            </w:pPr>
-            <w:r>
-              <w:t xml:space="preserve">не число so'm</w:t>
-            </w:r>
-          </w:p>
-        </w:tc>
-      </w:tr>
-      <w:tr>
-        <w:tc>
-          <w:p>
-            <w:pPr>
-              <w:jc w:val="center"/>
-            </w:pPr>
-            <w:r>
-              <w:t xml:space="preserve">8</w:t>
-            </w:r>
-          </w:p>
-        </w:tc>
-        <w:tc>
-          <w:p>
-            <w:pPr>
-              <w:jc w:val="center"/>
-            </w:pPr>
-            <w:r>
-              <w:t xml:space="preserve">Oyoqlar</w:t>
-            </w:r>
-          </w:p>
-        </w:tc>
-        <w:tc>
-          <w:p>
-            <w:pPr>
-              <w:jc w:val="center"/>
-            </w:pPr>
-          </w:p>
-        </w:tc>
-        <w:tc>
-          <w:p>
-            <w:pPr>
-              <w:jc w:val="center"/>
-            </w:pPr>
-            <w:r>
-              <w:t xml:space="preserve">0 so'm</w:t>
-            </w:r>
-          </w:p>
-        </w:tc>
-        <w:tc>
-          <w:p>
-            <w:pPr>
-              <w:jc w:val="center"/>
-            </w:pPr>
-            <w:r>
-              <w:t xml:space="preserve">не число so'm</w:t>
-            </w:r>
-          </w:p>
-        </w:tc>
-      </w:tr>
-      <w:tr>
-        <w:tc>
-          <w:p>
-            <w:pPr>
-              <w:jc w:val="center"/>
-            </w:pPr>
-            <w:r>
-              <w:t xml:space="preserve">9</w:t>
-            </w:r>
-          </w:p>
-        </w:tc>
-        <w:tc>
-          <w:p>
-            <w:pPr>
-              <w:jc w:val="center"/>
-            </w:pPr>
-            <w:r>
-              <w:t xml:space="preserve">Krestik</w:t>
-            </w:r>
-          </w:p>
-        </w:tc>
-        <w:tc>
-          <w:p>
-            <w:pPr>
-              <w:jc w:val="center"/>
-            </w:pPr>
-          </w:p>
-        </w:tc>
-        <w:tc>
-          <w:p>
-            <w:pPr>
-              <w:jc w:val="center"/>
-            </w:pPr>
-            <w:r>
-              <w:t xml:space="preserve">0 so'm</w:t>
-            </w:r>
-          </w:p>
-        </w:tc>
-        <w:tc>
-          <w:p>
-            <w:pPr>
-              <w:jc w:val="center"/>
-            </w:pPr>
-            <w:r>
-              <w:t xml:space="preserve">не число so'm</w:t>
-            </w:r>
-          </w:p>
-        </w:tc>
-      </w:tr>
-      <w:tr>
-        <w:tc>
-          <w:p>
-            <w:pPr>
-              <w:jc w:val="center"/>
-            </w:pPr>
-            <w:r>
-              <w:t xml:space="preserve">10</w:t>
-            </w:r>
-          </w:p>
-        </w:tc>
-        <w:tc>
-          <w:p>
-            <w:pPr>
-              <w:jc w:val="center"/>
-            </w:pPr>
-            <w:r>
-              <w:t xml:space="preserve">Taxta</w:t>
-            </w:r>
-          </w:p>
-        </w:tc>
-        <w:tc>
-          <w:p>
-            <w:pPr>
-              <w:jc w:val="center"/>
-            </w:pPr>
-          </w:p>
-        </w:tc>
-        <w:tc>
-          <w:p>
-            <w:pPr>
-              <w:jc w:val="center"/>
-            </w:pPr>
-            <w:r>
-              <w:t xml:space="preserve">0 so'm</w:t>
-            </w:r>
-          </w:p>
-        </w:tc>
-        <w:tc>
-          <w:p>
-            <w:pPr>
-              <w:jc w:val="center"/>
-            </w:pPr>
-            <w:r>
-              <w:t xml:space="preserve">не число so'm</w:t>
-            </w:r>
-          </w:p>
-        </w:tc>
-      </w:tr>
-      <w:tr>
-        <w:tc>
-          <w:p>
-            <w:pPr>
-              <w:jc w:val="center"/>
-            </w:pPr>
-            <w:r>
-              <w:t xml:space="preserve">11</w:t>
-            </w:r>
-          </w:p>
-        </w:tc>
-        <w:tc>
-          <w:p>
-            <w:pPr>
-              <w:jc w:val="center"/>
-            </w:pPr>
-            <w:r>
-              <w:t xml:space="preserve">Oyoqlar</w:t>
-            </w:r>
-          </w:p>
-        </w:tc>
-        <w:tc>
-          <w:p>
-            <w:pPr>
-              <w:jc w:val="center"/>
-            </w:pPr>
-          </w:p>
-        </w:tc>
-        <w:tc>
-          <w:p>
-            <w:pPr>
-              <w:jc w:val="center"/>
-            </w:pPr>
-            <w:r>
-              <w:t xml:space="preserve">0 so'm</w:t>
-            </w:r>
-          </w:p>
-        </w:tc>
-        <w:tc>
-          <w:p>
-            <w:pPr>
-              <w:jc w:val="center"/>
-            </w:pPr>
-            <w:r>
-              <w:t xml:space="preserve">не число so'm</w:t>
-            </w:r>
-          </w:p>
-        </w:tc>
-      </w:tr>
-      <w:tr>
-        <w:tc>
-          <w:p>
-            <w:pPr>
-              <w:jc w:val="center"/>
-            </w:pPr>
-            <w:r>
-              <w:t xml:space="preserve">12</w:t>
-            </w:r>
-          </w:p>
-        </w:tc>
-        <w:tc>
-          <w:p>
-            <w:pPr>
-              <w:jc w:val="center"/>
-            </w:pPr>
-            <w:r>
-              <w:t xml:space="preserve">Krestik</w:t>
-            </w:r>
-          </w:p>
-        </w:tc>
-        <w:tc>
-          <w:p>
-            <w:pPr>
-              <w:jc w:val="center"/>
-            </w:pPr>
-          </w:p>
-        </w:tc>
-        <w:tc>
-          <w:p>
-            <w:pPr>
-              <w:jc w:val="center"/>
-            </w:pPr>
-            <w:r>
-              <w:t xml:space="preserve">0 so'm</w:t>
-            </w:r>
-          </w:p>
-        </w:tc>
-        <w:tc>
-          <w:p>
-            <w:pPr>
-              <w:jc w:val="center"/>
-            </w:pPr>
-            <w:r>
-              <w:t xml:space="preserve">не число so'm</w:t>
+            <w:r>
+              <w:t xml:space="preserve">18 ta</w:t>
+            </w:r>
+          </w:p>
+        </w:tc>
+        <w:tc>
+          <w:p>
+            <w:pPr>
+              <w:jc w:val="center"/>
+            </w:pPr>
+            <w:r>
+              <w:t xml:space="preserve">95 000 so'm</w:t>
+            </w:r>
+          </w:p>
+        </w:tc>
+        <w:tc>
+          <w:p>
+            <w:pPr>
+              <w:jc w:val="center"/>
+            </w:pPr>
+            <w:r>
+              <w:t xml:space="preserve">1 710 000 so'm</w:t>
             </w:r>
           </w:p>
         </w:tc>
@@ -3487,7 +2245,7 @@
                 <w:szCs w:val="24"/>
                 <w:rFonts w:ascii="Times New Roman" w:cs="Times New Roman" w:eastAsia="Times New Roman" w:hAnsi="Times New Roman"/>
               </w:rPr>
-              <w:t xml:space="preserve">595 000</w:t>
+              <w:t xml:space="preserve">110 000</w:t>
             </w:r>
             <w:r>
               <w:t xml:space="preserve"> so'm</w:t>

</xml_diff>

<commit_message>
Order_id has been updated, filters in the returned and lost sections have been improved. New information has been added to the document and existing information has been updated.
</commit_message>
<xml_diff>
--- a/All_Orders_Report.docx
+++ b/All_Orders_Report.docx
@@ -298,7 +298,7 @@
                 <w:szCs w:val="24"/>
                 <w:rFonts w:ascii="Times New Roman" w:cs="Times New Roman" w:eastAsia="Times New Roman" w:hAnsi="Times New Roman"/>
               </w:rPr>
-              <w:t xml:space="preserve">Komolbek </w:t>
+              <w:t xml:space="preserve">Ramiziddin </w:t>
             </w:r>
             <w:r>
               <w:t xml:space="preserve">»</w:t>
@@ -359,7 +359,7 @@
                 <w:szCs w:val="24"/>
                 <w:rFonts w:ascii="Times New Roman" w:cs="Times New Roman" w:eastAsia="Times New Roman" w:hAnsi="Times New Roman"/>
               </w:rPr>
-              <w:t xml:space="preserve">+998 55 555 55 55</w:t>
+              <w:t xml:space="preserve">+998 77 070 70 70</w:t>
             </w:r>
             <w:r>
               <w:t xml:space="preserve"/>
@@ -910,6 +910,268 @@
           </w:p>
         </w:tc>
       </w:tr>
+      <w:tr>
+        <w:tc>
+          <w:p>
+            <w:pPr>
+              <w:spacing w:before="0" w:after="0"/>
+              <w:jc w:val="center"/>
+            </w:pPr>
+            <w:r>
+              <w:t xml:space="preserve">4</w:t>
+            </w:r>
+          </w:p>
+        </w:tc>
+        <w:tc>
+          <w:p>
+            <w:pPr>
+              <w:spacing w:before="0" w:after="0"/>
+              <w:jc w:val="center"/>
+            </w:pPr>
+            <w:r>
+              <w:t xml:space="preserve">Taxta</w:t>
+            </w:r>
+          </w:p>
+        </w:tc>
+        <w:tc>
+          <w:p>
+            <w:pPr>
+              <w:spacing w:before="0" w:after="0"/>
+              <w:jc w:val="center"/>
+            </w:pPr>
+            <w:r>
+              <w:t xml:space="preserve">20 ta</w:t>
+            </w:r>
+          </w:p>
+        </w:tc>
+        <w:tc>
+          <w:tcPr>
+            <w:vMerge w:val="restart"/>
+            <w:vAlign w:val="center"/>
+          </w:tcPr>
+          <w:p>
+            <w:pPr>
+              <w:spacing w:before="0" w:after="0"/>
+              <w:jc w:val="center"/>
+            </w:pPr>
+            <w:r>
+              <w:t xml:space="preserve">Lesa kres
+10 ta</w:t>
+            </w:r>
+          </w:p>
+        </w:tc>
+        <w:tc>
+          <w:tcPr>
+            <w:vMerge w:val="restart"/>
+            <w:vAlign w:val="center"/>
+          </w:tcPr>
+          <w:p>
+            <w:pPr>
+              <w:spacing w:before="0" w:after="0"/>
+              <w:jc w:val="center"/>
+            </w:pPr>
+            <w:r>
+              <w:t xml:space="preserve">29-07-2025</w:t>
+            </w:r>
+          </w:p>
+        </w:tc>
+        <w:tc>
+          <w:tcPr>
+            <w:vMerge w:val="restart"/>
+            <w:vAlign w:val="center"/>
+          </w:tcPr>
+          <w:p>
+            <w:pPr>
+              <w:spacing w:before="0" w:after="0"/>
+              <w:jc w:val="center"/>
+            </w:pPr>
+            <w:r>
+              <w:t xml:space="preserve">10 000 so'm</w:t>
+            </w:r>
+          </w:p>
+        </w:tc>
+        <w:tc>
+          <w:tcPr>
+            <w:vMerge w:val="restart"/>
+            <w:vAlign w:val="center"/>
+          </w:tcPr>
+          <w:p>
+            <w:pPr>
+              <w:spacing w:before="0" w:after="0"/>
+              <w:jc w:val="center"/>
+            </w:pPr>
+            <w:r>
+              <w:t xml:space="preserve">100 000 so'm</w:t>
+            </w:r>
+          </w:p>
+        </w:tc>
+      </w:tr>
+      <w:tr>
+        <w:tc>
+          <w:p>
+            <w:pPr>
+              <w:spacing w:before="0" w:after="0"/>
+              <w:jc w:val="center"/>
+            </w:pPr>
+            <w:r>
+              <w:t xml:space="preserve">5</w:t>
+            </w:r>
+          </w:p>
+        </w:tc>
+        <w:tc>
+          <w:p>
+            <w:pPr>
+              <w:spacing w:before="0" w:after="0"/>
+              <w:jc w:val="center"/>
+            </w:pPr>
+            <w:r>
+              <w:t xml:space="preserve">Oyoqlar</w:t>
+            </w:r>
+          </w:p>
+        </w:tc>
+        <w:tc>
+          <w:p>
+            <w:pPr>
+              <w:spacing w:before="0" w:after="0"/>
+              <w:jc w:val="center"/>
+            </w:pPr>
+            <w:r>
+              <w:t xml:space="preserve">20 ta</w:t>
+            </w:r>
+          </w:p>
+        </w:tc>
+        <w:tc>
+          <w:tcPr>
+            <w:vMerge w:val="continue"/>
+            <w:vAlign w:val="center"/>
+          </w:tcPr>
+          <w:p>
+            <w:pPr>
+              <w:spacing w:before="0" w:after="0"/>
+              <w:jc w:val="center"/>
+            </w:pPr>
+          </w:p>
+        </w:tc>
+        <w:tc>
+          <w:tcPr>
+            <w:vMerge w:val="continue"/>
+            <w:vAlign w:val="center"/>
+          </w:tcPr>
+          <w:p>
+            <w:pPr>
+              <w:spacing w:before="0" w:after="0"/>
+              <w:jc w:val="center"/>
+            </w:pPr>
+          </w:p>
+        </w:tc>
+        <w:tc>
+          <w:tcPr>
+            <w:vMerge w:val="continue"/>
+            <w:vAlign w:val="center"/>
+          </w:tcPr>
+          <w:p>
+            <w:pPr>
+              <w:spacing w:before="0" w:after="0"/>
+              <w:jc w:val="center"/>
+            </w:pPr>
+          </w:p>
+        </w:tc>
+        <w:tc>
+          <w:tcPr>
+            <w:vMerge w:val="continue"/>
+            <w:vAlign w:val="center"/>
+          </w:tcPr>
+          <w:p>
+            <w:pPr>
+              <w:spacing w:before="0" w:after="0"/>
+              <w:jc w:val="center"/>
+            </w:pPr>
+          </w:p>
+        </w:tc>
+      </w:tr>
+      <w:tr>
+        <w:tc>
+          <w:p>
+            <w:pPr>
+              <w:spacing w:before="0" w:after="0"/>
+              <w:jc w:val="center"/>
+            </w:pPr>
+            <w:r>
+              <w:t xml:space="preserve">6</w:t>
+            </w:r>
+          </w:p>
+        </w:tc>
+        <w:tc>
+          <w:p>
+            <w:pPr>
+              <w:spacing w:before="0" w:after="0"/>
+              <w:jc w:val="center"/>
+            </w:pPr>
+            <w:r>
+              <w:t xml:space="preserve">Krestik</w:t>
+            </w:r>
+          </w:p>
+        </w:tc>
+        <w:tc>
+          <w:p>
+            <w:pPr>
+              <w:spacing w:before="0" w:after="0"/>
+              <w:jc w:val="center"/>
+            </w:pPr>
+            <w:r>
+              <w:t xml:space="preserve">20 ta</w:t>
+            </w:r>
+          </w:p>
+        </w:tc>
+        <w:tc>
+          <w:tcPr>
+            <w:vMerge w:val="continue"/>
+            <w:vAlign w:val="center"/>
+          </w:tcPr>
+          <w:p>
+            <w:pPr>
+              <w:spacing w:before="0" w:after="0"/>
+              <w:jc w:val="center"/>
+            </w:pPr>
+          </w:p>
+        </w:tc>
+        <w:tc>
+          <w:tcPr>
+            <w:vMerge w:val="continue"/>
+            <w:vAlign w:val="center"/>
+          </w:tcPr>
+          <w:p>
+            <w:pPr>
+              <w:spacing w:before="0" w:after="0"/>
+              <w:jc w:val="center"/>
+            </w:pPr>
+          </w:p>
+        </w:tc>
+        <w:tc>
+          <w:tcPr>
+            <w:vMerge w:val="continue"/>
+            <w:vAlign w:val="center"/>
+          </w:tcPr>
+          <w:p>
+            <w:pPr>
+              <w:spacing w:before="0" w:after="0"/>
+              <w:jc w:val="center"/>
+            </w:pPr>
+          </w:p>
+        </w:tc>
+        <w:tc>
+          <w:tcPr>
+            <w:vMerge w:val="continue"/>
+            <w:vAlign w:val="center"/>
+          </w:tcPr>
+          <w:p>
+            <w:pPr>
+              <w:spacing w:before="0" w:after="0"/>
+              <w:jc w:val="center"/>
+            </w:pPr>
+          </w:p>
+        </w:tc>
+      </w:tr>
     </w:tbl>
     <w:p>
       <w:pPr>
@@ -1176,7 +1438,7 @@
               <w:jc w:val="center"/>
             </w:pPr>
             <w:r>
-              <w:t xml:space="preserve">2 ta</w:t>
+              <w:t xml:space="preserve">20 ta</w:t>
             </w:r>
           </w:p>
         </w:tc>
@@ -1192,7 +1454,7 @@
             </w:pPr>
             <w:r>
               <w:t xml:space="preserve">Lesa kres
-1 ta</w:t>
+10 ta</w:t>
             </w:r>
           </w:p>
         </w:tc>
@@ -1207,7 +1469,7 @@
               <w:jc w:val="center"/>
             </w:pPr>
             <w:r>
-              <w:t xml:space="preserve">30-07-2025</w:t>
+              <w:t xml:space="preserve">29-07-2025</w:t>
             </w:r>
           </w:p>
         </w:tc>
@@ -1222,7 +1484,7 @@
               <w:jc w:val="center"/>
             </w:pPr>
             <w:r>
-              <w:t xml:space="preserve">2 kun</w:t>
+              <w:t xml:space="preserve">1 kun</w:t>
             </w:r>
           </w:p>
         </w:tc>
@@ -1237,7 +1499,7 @@
               <w:jc w:val="center"/>
             </w:pPr>
             <w:r>
-              <w:t xml:space="preserve">0 so'm</w:t>
+              <w:t xml:space="preserve">100 000 so'm</w:t>
             </w:r>
           </w:p>
         </w:tc>
@@ -1272,7 +1534,7 @@
               <w:jc w:val="center"/>
             </w:pPr>
             <w:r>
-              <w:t xml:space="preserve">2 ta</w:t>
+              <w:t xml:space="preserve">20 ta</w:t>
             </w:r>
           </w:p>
         </w:tc>
@@ -1355,7 +1617,531 @@
               <w:jc w:val="center"/>
             </w:pPr>
             <w:r>
-              <w:t xml:space="preserve">2 ta</w:t>
+              <w:t xml:space="preserve">20 ta</w:t>
+            </w:r>
+          </w:p>
+        </w:tc>
+        <w:tc>
+          <w:tcPr>
+            <w:vMerge w:val="continue"/>
+            <w:vAlign w:val="center"/>
+          </w:tcPr>
+          <w:p>
+            <w:pPr>
+              <w:spacing w:before="0" w:after="0"/>
+              <w:jc w:val="center"/>
+            </w:pPr>
+          </w:p>
+        </w:tc>
+        <w:tc>
+          <w:tcPr>
+            <w:vMerge w:val="continue"/>
+            <w:vAlign w:val="center"/>
+          </w:tcPr>
+          <w:p>
+            <w:pPr>
+              <w:spacing w:before="0" w:after="0"/>
+              <w:jc w:val="center"/>
+            </w:pPr>
+          </w:p>
+        </w:tc>
+        <w:tc>
+          <w:tcPr>
+            <w:vMerge w:val="continue"/>
+            <w:vAlign w:val="center"/>
+          </w:tcPr>
+          <w:p>
+            <w:pPr>
+              <w:spacing w:before="0" w:after="0"/>
+              <w:jc w:val="center"/>
+            </w:pPr>
+          </w:p>
+        </w:tc>
+        <w:tc>
+          <w:tcPr>
+            <w:vMerge w:val="continue"/>
+            <w:vAlign w:val="center"/>
+          </w:tcPr>
+          <w:p>
+            <w:pPr>
+              <w:spacing w:before="0" w:after="0"/>
+              <w:jc w:val="center"/>
+            </w:pPr>
+          </w:p>
+        </w:tc>
+      </w:tr>
+      <w:tr>
+        <w:tc>
+          <w:p>
+            <w:pPr>
+              <w:spacing w:before="0" w:after="0"/>
+              <w:jc w:val="center"/>
+            </w:pPr>
+            <w:r>
+              <w:t xml:space="preserve">4</w:t>
+            </w:r>
+          </w:p>
+        </w:tc>
+        <w:tc>
+          <w:p>
+            <w:pPr>
+              <w:spacing w:before="0" w:after="0"/>
+              <w:jc w:val="center"/>
+            </w:pPr>
+            <w:r>
+              <w:t xml:space="preserve">Taxta</w:t>
+            </w:r>
+          </w:p>
+        </w:tc>
+        <w:tc>
+          <w:p>
+            <w:pPr>
+              <w:spacing w:before="0" w:after="0"/>
+              <w:jc w:val="center"/>
+            </w:pPr>
+            <w:r>
+              <w:t xml:space="preserve">10 ta</w:t>
+            </w:r>
+          </w:p>
+        </w:tc>
+        <w:tc>
+          <w:tcPr>
+            <w:vMerge w:val="restart"/>
+            <w:vAlign w:val="center"/>
+          </w:tcPr>
+          <w:p>
+            <w:pPr>
+              <w:spacing w:before="0" w:after="0"/>
+              <w:jc w:val="center"/>
+            </w:pPr>
+            <w:r>
+              <w:t xml:space="preserve">Lesa kres
+5 ta</w:t>
+            </w:r>
+          </w:p>
+        </w:tc>
+        <w:tc>
+          <w:tcPr>
+            <w:vMerge w:val="restart"/>
+            <w:vAlign w:val="center"/>
+          </w:tcPr>
+          <w:p>
+            <w:pPr>
+              <w:spacing w:before="0" w:after="0"/>
+              <w:jc w:val="center"/>
+            </w:pPr>
+            <w:r>
+              <w:t xml:space="preserve">31-07-2025</w:t>
+            </w:r>
+          </w:p>
+        </w:tc>
+        <w:tc>
+          <w:tcPr>
+            <w:vMerge w:val="restart"/>
+            <w:vAlign w:val="center"/>
+          </w:tcPr>
+          <w:p>
+            <w:pPr>
+              <w:spacing w:before="0" w:after="0"/>
+              <w:jc w:val="center"/>
+            </w:pPr>
+            <w:r>
+              <w:t xml:space="preserve">3 kun</w:t>
+            </w:r>
+          </w:p>
+        </w:tc>
+        <w:tc>
+          <w:tcPr>
+            <w:vMerge w:val="restart"/>
+            <w:vAlign w:val="center"/>
+          </w:tcPr>
+          <w:p>
+            <w:pPr>
+              <w:spacing w:before="0" w:after="0"/>
+              <w:jc w:val="center"/>
+            </w:pPr>
+            <w:r>
+              <w:t xml:space="preserve">150 000 so'm</w:t>
+            </w:r>
+          </w:p>
+        </w:tc>
+      </w:tr>
+      <w:tr>
+        <w:tc>
+          <w:p>
+            <w:pPr>
+              <w:spacing w:before="0" w:after="0"/>
+              <w:jc w:val="center"/>
+            </w:pPr>
+            <w:r>
+              <w:t xml:space="preserve">5</w:t>
+            </w:r>
+          </w:p>
+        </w:tc>
+        <w:tc>
+          <w:p>
+            <w:pPr>
+              <w:spacing w:before="0" w:after="0"/>
+              <w:jc w:val="center"/>
+            </w:pPr>
+            <w:r>
+              <w:t xml:space="preserve">Oyoqlar</w:t>
+            </w:r>
+          </w:p>
+        </w:tc>
+        <w:tc>
+          <w:p>
+            <w:pPr>
+              <w:spacing w:before="0" w:after="0"/>
+              <w:jc w:val="center"/>
+            </w:pPr>
+            <w:r>
+              <w:t xml:space="preserve">10 ta</w:t>
+            </w:r>
+          </w:p>
+        </w:tc>
+        <w:tc>
+          <w:tcPr>
+            <w:vMerge w:val="continue"/>
+            <w:vAlign w:val="center"/>
+          </w:tcPr>
+          <w:p>
+            <w:pPr>
+              <w:spacing w:before="0" w:after="0"/>
+              <w:jc w:val="center"/>
+            </w:pPr>
+          </w:p>
+        </w:tc>
+        <w:tc>
+          <w:tcPr>
+            <w:vMerge w:val="continue"/>
+            <w:vAlign w:val="center"/>
+          </w:tcPr>
+          <w:p>
+            <w:pPr>
+              <w:spacing w:before="0" w:after="0"/>
+              <w:jc w:val="center"/>
+            </w:pPr>
+          </w:p>
+        </w:tc>
+        <w:tc>
+          <w:tcPr>
+            <w:vMerge w:val="continue"/>
+            <w:vAlign w:val="center"/>
+          </w:tcPr>
+          <w:p>
+            <w:pPr>
+              <w:spacing w:before="0" w:after="0"/>
+              <w:jc w:val="center"/>
+            </w:pPr>
+          </w:p>
+        </w:tc>
+        <w:tc>
+          <w:tcPr>
+            <w:vMerge w:val="continue"/>
+            <w:vAlign w:val="center"/>
+          </w:tcPr>
+          <w:p>
+            <w:pPr>
+              <w:spacing w:before="0" w:after="0"/>
+              <w:jc w:val="center"/>
+            </w:pPr>
+          </w:p>
+        </w:tc>
+      </w:tr>
+      <w:tr>
+        <w:tc>
+          <w:p>
+            <w:pPr>
+              <w:spacing w:before="0" w:after="0"/>
+              <w:jc w:val="center"/>
+            </w:pPr>
+            <w:r>
+              <w:t xml:space="preserve">6</w:t>
+            </w:r>
+          </w:p>
+        </w:tc>
+        <w:tc>
+          <w:p>
+            <w:pPr>
+              <w:spacing w:before="0" w:after="0"/>
+              <w:jc w:val="center"/>
+            </w:pPr>
+            <w:r>
+              <w:t xml:space="preserve">Krestik</w:t>
+            </w:r>
+          </w:p>
+        </w:tc>
+        <w:tc>
+          <w:p>
+            <w:pPr>
+              <w:spacing w:before="0" w:after="0"/>
+              <w:jc w:val="center"/>
+            </w:pPr>
+            <w:r>
+              <w:t xml:space="preserve">10 ta</w:t>
+            </w:r>
+          </w:p>
+        </w:tc>
+        <w:tc>
+          <w:tcPr>
+            <w:vMerge w:val="continue"/>
+            <w:vAlign w:val="center"/>
+          </w:tcPr>
+          <w:p>
+            <w:pPr>
+              <w:spacing w:before="0" w:after="0"/>
+              <w:jc w:val="center"/>
+            </w:pPr>
+          </w:p>
+        </w:tc>
+        <w:tc>
+          <w:tcPr>
+            <w:vMerge w:val="continue"/>
+            <w:vAlign w:val="center"/>
+          </w:tcPr>
+          <w:p>
+            <w:pPr>
+              <w:spacing w:before="0" w:after="0"/>
+              <w:jc w:val="center"/>
+            </w:pPr>
+          </w:p>
+        </w:tc>
+        <w:tc>
+          <w:tcPr>
+            <w:vMerge w:val="continue"/>
+            <w:vAlign w:val="center"/>
+          </w:tcPr>
+          <w:p>
+            <w:pPr>
+              <w:spacing w:before="0" w:after="0"/>
+              <w:jc w:val="center"/>
+            </w:pPr>
+          </w:p>
+        </w:tc>
+        <w:tc>
+          <w:tcPr>
+            <w:vMerge w:val="continue"/>
+            <w:vAlign w:val="center"/>
+          </w:tcPr>
+          <w:p>
+            <w:pPr>
+              <w:spacing w:before="0" w:after="0"/>
+              <w:jc w:val="center"/>
+            </w:pPr>
+          </w:p>
+        </w:tc>
+      </w:tr>
+      <w:tr>
+        <w:tc>
+          <w:p>
+            <w:pPr>
+              <w:spacing w:before="0" w:after="0"/>
+              <w:jc w:val="center"/>
+            </w:pPr>
+            <w:r>
+              <w:t xml:space="preserve">7</w:t>
+            </w:r>
+          </w:p>
+        </w:tc>
+        <w:tc>
+          <w:p>
+            <w:pPr>
+              <w:spacing w:before="0" w:after="0"/>
+              <w:jc w:val="center"/>
+            </w:pPr>
+            <w:r>
+              <w:t xml:space="preserve">Taxta</w:t>
+            </w:r>
+          </w:p>
+        </w:tc>
+        <w:tc>
+          <w:p>
+            <w:pPr>
+              <w:spacing w:before="0" w:after="0"/>
+              <w:jc w:val="center"/>
+            </w:pPr>
+            <w:r>
+              <w:t xml:space="preserve">10 ta</w:t>
+            </w:r>
+          </w:p>
+        </w:tc>
+        <w:tc>
+          <w:tcPr>
+            <w:vMerge w:val="restart"/>
+            <w:vAlign w:val="center"/>
+          </w:tcPr>
+          <w:p>
+            <w:pPr>
+              <w:spacing w:before="0" w:after="0"/>
+              <w:jc w:val="center"/>
+            </w:pPr>
+            <w:r>
+              <w:t xml:space="preserve">Lesa kres
+5 ta</w:t>
+            </w:r>
+          </w:p>
+        </w:tc>
+        <w:tc>
+          <w:tcPr>
+            <w:vMerge w:val="restart"/>
+            <w:vAlign w:val="center"/>
+          </w:tcPr>
+          <w:p>
+            <w:pPr>
+              <w:spacing w:before="0" w:after="0"/>
+              <w:jc w:val="center"/>
+            </w:pPr>
+            <w:r>
+              <w:t xml:space="preserve">01-08-2025</w:t>
+            </w:r>
+          </w:p>
+        </w:tc>
+        <w:tc>
+          <w:tcPr>
+            <w:vMerge w:val="restart"/>
+            <w:vAlign w:val="center"/>
+          </w:tcPr>
+          <w:p>
+            <w:pPr>
+              <w:spacing w:before="0" w:after="0"/>
+              <w:jc w:val="center"/>
+            </w:pPr>
+            <w:r>
+              <w:t xml:space="preserve">4 kun</w:t>
+            </w:r>
+          </w:p>
+        </w:tc>
+        <w:tc>
+          <w:tcPr>
+            <w:vMerge w:val="restart"/>
+            <w:vAlign w:val="center"/>
+          </w:tcPr>
+          <w:p>
+            <w:pPr>
+              <w:spacing w:before="0" w:after="0"/>
+              <w:jc w:val="center"/>
+            </w:pPr>
+            <w:r>
+              <w:t xml:space="preserve">200 000 so'm</w:t>
+            </w:r>
+          </w:p>
+        </w:tc>
+      </w:tr>
+      <w:tr>
+        <w:tc>
+          <w:p>
+            <w:pPr>
+              <w:spacing w:before="0" w:after="0"/>
+              <w:jc w:val="center"/>
+            </w:pPr>
+            <w:r>
+              <w:t xml:space="preserve">8</w:t>
+            </w:r>
+          </w:p>
+        </w:tc>
+        <w:tc>
+          <w:p>
+            <w:pPr>
+              <w:spacing w:before="0" w:after="0"/>
+              <w:jc w:val="center"/>
+            </w:pPr>
+            <w:r>
+              <w:t xml:space="preserve">Oyoqlar</w:t>
+            </w:r>
+          </w:p>
+        </w:tc>
+        <w:tc>
+          <w:p>
+            <w:pPr>
+              <w:spacing w:before="0" w:after="0"/>
+              <w:jc w:val="center"/>
+            </w:pPr>
+            <w:r>
+              <w:t xml:space="preserve">10 ta</w:t>
+            </w:r>
+          </w:p>
+        </w:tc>
+        <w:tc>
+          <w:tcPr>
+            <w:vMerge w:val="continue"/>
+            <w:vAlign w:val="center"/>
+          </w:tcPr>
+          <w:p>
+            <w:pPr>
+              <w:spacing w:before="0" w:after="0"/>
+              <w:jc w:val="center"/>
+            </w:pPr>
+          </w:p>
+        </w:tc>
+        <w:tc>
+          <w:tcPr>
+            <w:vMerge w:val="continue"/>
+            <w:vAlign w:val="center"/>
+          </w:tcPr>
+          <w:p>
+            <w:pPr>
+              <w:spacing w:before="0" w:after="0"/>
+              <w:jc w:val="center"/>
+            </w:pPr>
+          </w:p>
+        </w:tc>
+        <w:tc>
+          <w:tcPr>
+            <w:vMerge w:val="continue"/>
+            <w:vAlign w:val="center"/>
+          </w:tcPr>
+          <w:p>
+            <w:pPr>
+              <w:spacing w:before="0" w:after="0"/>
+              <w:jc w:val="center"/>
+            </w:pPr>
+          </w:p>
+        </w:tc>
+        <w:tc>
+          <w:tcPr>
+            <w:vMerge w:val="continue"/>
+            <w:vAlign w:val="center"/>
+          </w:tcPr>
+          <w:p>
+            <w:pPr>
+              <w:spacing w:before="0" w:after="0"/>
+              <w:jc w:val="center"/>
+            </w:pPr>
+          </w:p>
+        </w:tc>
+      </w:tr>
+      <w:tr>
+        <w:tc>
+          <w:p>
+            <w:pPr>
+              <w:spacing w:before="0" w:after="0"/>
+              <w:jc w:val="center"/>
+            </w:pPr>
+            <w:r>
+              <w:t xml:space="preserve">9</w:t>
+            </w:r>
+          </w:p>
+        </w:tc>
+        <w:tc>
+          <w:p>
+            <w:pPr>
+              <w:spacing w:before="0" w:after="0"/>
+              <w:jc w:val="center"/>
+            </w:pPr>
+            <w:r>
+              <w:t xml:space="preserve">Krestik</w:t>
+            </w:r>
+          </w:p>
+        </w:tc>
+        <w:tc>
+          <w:p>
+            <w:pPr>
+              <w:spacing w:before="0" w:after="0"/>
+              <w:jc w:val="center"/>
+            </w:pPr>
+            <w:r>
+              <w:t xml:space="preserve">10 ta</w:t>
             </w:r>
           </w:p>
         </w:tc>
@@ -1598,156 +2384,15 @@
       </w:tr>
       <w:tr>
         <w:tc>
-          <w:p>
-            <w:pPr>
-              <w:jc w:val="center"/>
-            </w:pPr>
-            <w:r>
-              <w:t xml:space="preserve">1</w:t>
-            </w:r>
-          </w:p>
-        </w:tc>
-        <w:tc>
-          <w:p>
-            <w:pPr>
-              <w:jc w:val="center"/>
-            </w:pPr>
-            <w:r>
-              <w:t xml:space="preserve">Taxta</w:t>
-            </w:r>
-          </w:p>
-        </w:tc>
-        <w:tc>
-          <w:p>
-            <w:pPr>
-              <w:jc w:val="center"/>
-            </w:pPr>
-            <w:r>
-              <w:t xml:space="preserve">18 ta</w:t>
-            </w:r>
-          </w:p>
-        </w:tc>
-        <w:tc>
-          <w:p>
-            <w:pPr>
-              <w:jc w:val="center"/>
-            </w:pPr>
-            <w:r>
-              <w:t xml:space="preserve">75 000 so'm</w:t>
-            </w:r>
-          </w:p>
-        </w:tc>
-        <w:tc>
-          <w:p>
-            <w:pPr>
-              <w:jc w:val="center"/>
-            </w:pPr>
-            <w:r>
-              <w:t xml:space="preserve">1 350 000 so'm</w:t>
-            </w:r>
-          </w:p>
-        </w:tc>
-      </w:tr>
-      <w:tr>
-        <w:tc>
-          <w:p>
-            <w:pPr>
-              <w:jc w:val="center"/>
-            </w:pPr>
-            <w:r>
-              <w:t xml:space="preserve">2</w:t>
-            </w:r>
-          </w:p>
-        </w:tc>
-        <w:tc>
-          <w:p>
-            <w:pPr>
-              <w:jc w:val="center"/>
-            </w:pPr>
-            <w:r>
-              <w:t xml:space="preserve">Oyoqlar</w:t>
-            </w:r>
-          </w:p>
-        </w:tc>
-        <w:tc>
-          <w:p>
-            <w:pPr>
-              <w:jc w:val="center"/>
-            </w:pPr>
-            <w:r>
-              <w:t xml:space="preserve">18 ta</w:t>
-            </w:r>
-          </w:p>
-        </w:tc>
-        <w:tc>
-          <w:p>
-            <w:pPr>
-              <w:jc w:val="center"/>
-            </w:pPr>
-            <w:r>
-              <w:t xml:space="preserve">95 000 so'm</w:t>
-            </w:r>
-          </w:p>
-        </w:tc>
-        <w:tc>
-          <w:p>
-            <w:pPr>
-              <w:jc w:val="center"/>
-            </w:pPr>
-            <w:r>
-              <w:t xml:space="preserve">1 710 000 so'm</w:t>
-            </w:r>
-          </w:p>
-        </w:tc>
-      </w:tr>
-      <w:tr>
-        <w:tc>
-          <w:p>
-            <w:pPr>
-              <w:jc w:val="center"/>
-            </w:pPr>
-            <w:r>
-              <w:t xml:space="preserve">3</w:t>
-            </w:r>
-          </w:p>
-        </w:tc>
-        <w:tc>
-          <w:p>
-            <w:pPr>
-              <w:jc w:val="center"/>
-            </w:pPr>
-            <w:r>
-              <w:t xml:space="preserve">Krestik</w:t>
-            </w:r>
-          </w:p>
-        </w:tc>
-        <w:tc>
-          <w:p>
-            <w:pPr>
-              <w:jc w:val="center"/>
-            </w:pPr>
-            <w:r>
-              <w:t xml:space="preserve">18 ta</w:t>
-            </w:r>
-          </w:p>
-        </w:tc>
-        <w:tc>
-          <w:p>
-            <w:pPr>
-              <w:jc w:val="center"/>
-            </w:pPr>
-            <w:r>
-              <w:t xml:space="preserve">95 000 so'm</w:t>
-            </w:r>
-          </w:p>
-        </w:tc>
-        <w:tc>
-          <w:p>
-            <w:pPr>
-              <w:jc w:val="center"/>
-            </w:pPr>
-            <w:r>
-              <w:t xml:space="preserve">1 710 000 so'm</w:t>
+          <w:tcPr>
+            <w:gridSpan w:val="5"/>
+          </w:tcPr>
+          <w:p>
+            <w:pPr>
+              <w:jc w:val="center"/>
+            </w:pPr>
+            <w:r>
+              <w:t xml:space="preserve">Ma'lumot yo'q</w:t>
             </w:r>
           </w:p>
         </w:tc>
@@ -2245,7 +2890,7 @@
                 <w:szCs w:val="24"/>
                 <w:rFonts w:ascii="Times New Roman" w:cs="Times New Roman" w:eastAsia="Times New Roman" w:hAnsi="Times New Roman"/>
               </w:rPr>
-              <w:t xml:space="preserve">110 000</w:t>
+              <w:t xml:space="preserve">450 000</w:t>
             </w:r>
             <w:r>
               <w:t xml:space="preserve"> so'm</w:t>

</xml_diff>

<commit_message>
During the document creation process, new lost product information was added, existing information was updated, and rows were changed. The cross and board names were changed, and new information was entered in the payments section.
</commit_message>
<xml_diff>
--- a/All_Orders_Report.docx
+++ b/All_Orders_Report.docx
@@ -929,7 +929,7 @@
               <w:jc w:val="center"/>
             </w:pPr>
             <w:r>
-              <w:t xml:space="preserve">Taxta</w:t>
+              <w:t xml:space="preserve">Krestik</w:t>
             </w:r>
           </w:p>
         </w:tc>
@@ -1098,6 +1098,530 @@
             </w:pPr>
             <w:r>
               <w:t xml:space="preserve">6</w:t>
+            </w:r>
+          </w:p>
+        </w:tc>
+        <w:tc>
+          <w:p>
+            <w:pPr>
+              <w:spacing w:before="0" w:after="0"/>
+              <w:jc w:val="center"/>
+            </w:pPr>
+            <w:r>
+              <w:t xml:space="preserve">Taxta</w:t>
+            </w:r>
+          </w:p>
+        </w:tc>
+        <w:tc>
+          <w:p>
+            <w:pPr>
+              <w:spacing w:before="0" w:after="0"/>
+              <w:jc w:val="center"/>
+            </w:pPr>
+            <w:r>
+              <w:t xml:space="preserve">20 ta</w:t>
+            </w:r>
+          </w:p>
+        </w:tc>
+        <w:tc>
+          <w:tcPr>
+            <w:vMerge w:val="continue"/>
+            <w:vAlign w:val="center"/>
+          </w:tcPr>
+          <w:p>
+            <w:pPr>
+              <w:spacing w:before="0" w:after="0"/>
+              <w:jc w:val="center"/>
+            </w:pPr>
+          </w:p>
+        </w:tc>
+        <w:tc>
+          <w:tcPr>
+            <w:vMerge w:val="continue"/>
+            <w:vAlign w:val="center"/>
+          </w:tcPr>
+          <w:p>
+            <w:pPr>
+              <w:spacing w:before="0" w:after="0"/>
+              <w:jc w:val="center"/>
+            </w:pPr>
+          </w:p>
+        </w:tc>
+        <w:tc>
+          <w:tcPr>
+            <w:vMerge w:val="continue"/>
+            <w:vAlign w:val="center"/>
+          </w:tcPr>
+          <w:p>
+            <w:pPr>
+              <w:spacing w:before="0" w:after="0"/>
+              <w:jc w:val="center"/>
+            </w:pPr>
+          </w:p>
+        </w:tc>
+        <w:tc>
+          <w:tcPr>
+            <w:vMerge w:val="continue"/>
+            <w:vAlign w:val="center"/>
+          </w:tcPr>
+          <w:p>
+            <w:pPr>
+              <w:spacing w:before="0" w:after="0"/>
+              <w:jc w:val="center"/>
+            </w:pPr>
+          </w:p>
+        </w:tc>
+      </w:tr>
+      <w:tr>
+        <w:tc>
+          <w:p>
+            <w:pPr>
+              <w:spacing w:before="0" w:after="0"/>
+              <w:jc w:val="center"/>
+            </w:pPr>
+            <w:r>
+              <w:t xml:space="preserve">7</w:t>
+            </w:r>
+          </w:p>
+        </w:tc>
+        <w:tc>
+          <w:p>
+            <w:pPr>
+              <w:spacing w:before="0" w:after="0"/>
+              <w:jc w:val="center"/>
+            </w:pPr>
+            <w:r>
+              <w:t xml:space="preserve">Krestik</w:t>
+            </w:r>
+          </w:p>
+        </w:tc>
+        <w:tc>
+          <w:p>
+            <w:pPr>
+              <w:spacing w:before="0" w:after="0"/>
+              <w:jc w:val="center"/>
+            </w:pPr>
+            <w:r>
+              <w:t xml:space="preserve">20 ta</w:t>
+            </w:r>
+          </w:p>
+        </w:tc>
+        <w:tc>
+          <w:tcPr>
+            <w:vMerge w:val="restart"/>
+            <w:vAlign w:val="center"/>
+          </w:tcPr>
+          <w:p>
+            <w:pPr>
+              <w:spacing w:before="0" w:after="0"/>
+              <w:jc w:val="center"/>
+            </w:pPr>
+            <w:r>
+              <w:t xml:space="preserve">Lesa kres
+10 ta</w:t>
+            </w:r>
+          </w:p>
+        </w:tc>
+        <w:tc>
+          <w:tcPr>
+            <w:vMerge w:val="restart"/>
+            <w:vAlign w:val="center"/>
+          </w:tcPr>
+          <w:p>
+            <w:pPr>
+              <w:spacing w:before="0" w:after="0"/>
+              <w:jc w:val="center"/>
+            </w:pPr>
+            <w:r>
+              <w:t xml:space="preserve">29-07-2025</w:t>
+            </w:r>
+          </w:p>
+        </w:tc>
+        <w:tc>
+          <w:tcPr>
+            <w:vMerge w:val="restart"/>
+            <w:vAlign w:val="center"/>
+          </w:tcPr>
+          <w:p>
+            <w:pPr>
+              <w:spacing w:before="0" w:after="0"/>
+              <w:jc w:val="center"/>
+            </w:pPr>
+            <w:r>
+              <w:t xml:space="preserve">10 000 so'm</w:t>
+            </w:r>
+          </w:p>
+        </w:tc>
+        <w:tc>
+          <w:tcPr>
+            <w:vMerge w:val="restart"/>
+            <w:vAlign w:val="center"/>
+          </w:tcPr>
+          <w:p>
+            <w:pPr>
+              <w:spacing w:before="0" w:after="0"/>
+              <w:jc w:val="center"/>
+            </w:pPr>
+            <w:r>
+              <w:t xml:space="preserve">100 000 so'm</w:t>
+            </w:r>
+          </w:p>
+        </w:tc>
+      </w:tr>
+      <w:tr>
+        <w:tc>
+          <w:p>
+            <w:pPr>
+              <w:spacing w:before="0" w:after="0"/>
+              <w:jc w:val="center"/>
+            </w:pPr>
+            <w:r>
+              <w:t xml:space="preserve">8</w:t>
+            </w:r>
+          </w:p>
+        </w:tc>
+        <w:tc>
+          <w:p>
+            <w:pPr>
+              <w:spacing w:before="0" w:after="0"/>
+              <w:jc w:val="center"/>
+            </w:pPr>
+            <w:r>
+              <w:t xml:space="preserve">Oyoqlar</w:t>
+            </w:r>
+          </w:p>
+        </w:tc>
+        <w:tc>
+          <w:p>
+            <w:pPr>
+              <w:spacing w:before="0" w:after="0"/>
+              <w:jc w:val="center"/>
+            </w:pPr>
+            <w:r>
+              <w:t xml:space="preserve">20 ta</w:t>
+            </w:r>
+          </w:p>
+        </w:tc>
+        <w:tc>
+          <w:tcPr>
+            <w:vMerge w:val="continue"/>
+            <w:vAlign w:val="center"/>
+          </w:tcPr>
+          <w:p>
+            <w:pPr>
+              <w:spacing w:before="0" w:after="0"/>
+              <w:jc w:val="center"/>
+            </w:pPr>
+          </w:p>
+        </w:tc>
+        <w:tc>
+          <w:tcPr>
+            <w:vMerge w:val="continue"/>
+            <w:vAlign w:val="center"/>
+          </w:tcPr>
+          <w:p>
+            <w:pPr>
+              <w:spacing w:before="0" w:after="0"/>
+              <w:jc w:val="center"/>
+            </w:pPr>
+          </w:p>
+        </w:tc>
+        <w:tc>
+          <w:tcPr>
+            <w:vMerge w:val="continue"/>
+            <w:vAlign w:val="center"/>
+          </w:tcPr>
+          <w:p>
+            <w:pPr>
+              <w:spacing w:before="0" w:after="0"/>
+              <w:jc w:val="center"/>
+            </w:pPr>
+          </w:p>
+        </w:tc>
+        <w:tc>
+          <w:tcPr>
+            <w:vMerge w:val="continue"/>
+            <w:vAlign w:val="center"/>
+          </w:tcPr>
+          <w:p>
+            <w:pPr>
+              <w:spacing w:before="0" w:after="0"/>
+              <w:jc w:val="center"/>
+            </w:pPr>
+          </w:p>
+        </w:tc>
+      </w:tr>
+      <w:tr>
+        <w:tc>
+          <w:p>
+            <w:pPr>
+              <w:spacing w:before="0" w:after="0"/>
+              <w:jc w:val="center"/>
+            </w:pPr>
+            <w:r>
+              <w:t xml:space="preserve">9</w:t>
+            </w:r>
+          </w:p>
+        </w:tc>
+        <w:tc>
+          <w:p>
+            <w:pPr>
+              <w:spacing w:before="0" w:after="0"/>
+              <w:jc w:val="center"/>
+            </w:pPr>
+            <w:r>
+              <w:t xml:space="preserve">Taxta</w:t>
+            </w:r>
+          </w:p>
+        </w:tc>
+        <w:tc>
+          <w:p>
+            <w:pPr>
+              <w:spacing w:before="0" w:after="0"/>
+              <w:jc w:val="center"/>
+            </w:pPr>
+            <w:r>
+              <w:t xml:space="preserve">20 ta</w:t>
+            </w:r>
+          </w:p>
+        </w:tc>
+        <w:tc>
+          <w:tcPr>
+            <w:vMerge w:val="continue"/>
+            <w:vAlign w:val="center"/>
+          </w:tcPr>
+          <w:p>
+            <w:pPr>
+              <w:spacing w:before="0" w:after="0"/>
+              <w:jc w:val="center"/>
+            </w:pPr>
+          </w:p>
+        </w:tc>
+        <w:tc>
+          <w:tcPr>
+            <w:vMerge w:val="continue"/>
+            <w:vAlign w:val="center"/>
+          </w:tcPr>
+          <w:p>
+            <w:pPr>
+              <w:spacing w:before="0" w:after="0"/>
+              <w:jc w:val="center"/>
+            </w:pPr>
+          </w:p>
+        </w:tc>
+        <w:tc>
+          <w:tcPr>
+            <w:vMerge w:val="continue"/>
+            <w:vAlign w:val="center"/>
+          </w:tcPr>
+          <w:p>
+            <w:pPr>
+              <w:spacing w:before="0" w:after="0"/>
+              <w:jc w:val="center"/>
+            </w:pPr>
+          </w:p>
+        </w:tc>
+        <w:tc>
+          <w:tcPr>
+            <w:vMerge w:val="continue"/>
+            <w:vAlign w:val="center"/>
+          </w:tcPr>
+          <w:p>
+            <w:pPr>
+              <w:spacing w:before="0" w:after="0"/>
+              <w:jc w:val="center"/>
+            </w:pPr>
+          </w:p>
+        </w:tc>
+      </w:tr>
+      <w:tr>
+        <w:tc>
+          <w:p>
+            <w:pPr>
+              <w:spacing w:before="0" w:after="0"/>
+              <w:jc w:val="center"/>
+            </w:pPr>
+            <w:r>
+              <w:t xml:space="preserve">10</w:t>
+            </w:r>
+          </w:p>
+        </w:tc>
+        <w:tc>
+          <w:p>
+            <w:pPr>
+              <w:spacing w:before="0" w:after="0"/>
+              <w:jc w:val="center"/>
+            </w:pPr>
+            <w:r>
+              <w:t xml:space="preserve">Taxta</w:t>
+            </w:r>
+          </w:p>
+        </w:tc>
+        <w:tc>
+          <w:p>
+            <w:pPr>
+              <w:spacing w:before="0" w:after="0"/>
+              <w:jc w:val="center"/>
+            </w:pPr>
+            <w:r>
+              <w:t xml:space="preserve">20 ta</w:t>
+            </w:r>
+          </w:p>
+        </w:tc>
+        <w:tc>
+          <w:tcPr>
+            <w:vMerge w:val="restart"/>
+            <w:vAlign w:val="center"/>
+          </w:tcPr>
+          <w:p>
+            <w:pPr>
+              <w:spacing w:before="0" w:after="0"/>
+              <w:jc w:val="center"/>
+            </w:pPr>
+            <w:r>
+              <w:t xml:space="preserve">Lesa kres
+10 ta</w:t>
+            </w:r>
+          </w:p>
+        </w:tc>
+        <w:tc>
+          <w:tcPr>
+            <w:vMerge w:val="restart"/>
+            <w:vAlign w:val="center"/>
+          </w:tcPr>
+          <w:p>
+            <w:pPr>
+              <w:spacing w:before="0" w:after="0"/>
+              <w:jc w:val="center"/>
+            </w:pPr>
+            <w:r>
+              <w:t xml:space="preserve">29-07-2025</w:t>
+            </w:r>
+          </w:p>
+        </w:tc>
+        <w:tc>
+          <w:tcPr>
+            <w:vMerge w:val="restart"/>
+            <w:vAlign w:val="center"/>
+          </w:tcPr>
+          <w:p>
+            <w:pPr>
+              <w:spacing w:before="0" w:after="0"/>
+              <w:jc w:val="center"/>
+            </w:pPr>
+            <w:r>
+              <w:t xml:space="preserve">10 000 so'm</w:t>
+            </w:r>
+          </w:p>
+        </w:tc>
+        <w:tc>
+          <w:tcPr>
+            <w:vMerge w:val="restart"/>
+            <w:vAlign w:val="center"/>
+          </w:tcPr>
+          <w:p>
+            <w:pPr>
+              <w:spacing w:before="0" w:after="0"/>
+              <w:jc w:val="center"/>
+            </w:pPr>
+            <w:r>
+              <w:t xml:space="preserve">100 000 so'm</w:t>
+            </w:r>
+          </w:p>
+        </w:tc>
+      </w:tr>
+      <w:tr>
+        <w:tc>
+          <w:p>
+            <w:pPr>
+              <w:spacing w:before="0" w:after="0"/>
+              <w:jc w:val="center"/>
+            </w:pPr>
+            <w:r>
+              <w:t xml:space="preserve">11</w:t>
+            </w:r>
+          </w:p>
+        </w:tc>
+        <w:tc>
+          <w:p>
+            <w:pPr>
+              <w:spacing w:before="0" w:after="0"/>
+              <w:jc w:val="center"/>
+            </w:pPr>
+            <w:r>
+              <w:t xml:space="preserve">Oyoqlar</w:t>
+            </w:r>
+          </w:p>
+        </w:tc>
+        <w:tc>
+          <w:p>
+            <w:pPr>
+              <w:spacing w:before="0" w:after="0"/>
+              <w:jc w:val="center"/>
+            </w:pPr>
+            <w:r>
+              <w:t xml:space="preserve">20 ta</w:t>
+            </w:r>
+          </w:p>
+        </w:tc>
+        <w:tc>
+          <w:tcPr>
+            <w:vMerge w:val="continue"/>
+            <w:vAlign w:val="center"/>
+          </w:tcPr>
+          <w:p>
+            <w:pPr>
+              <w:spacing w:before="0" w:after="0"/>
+              <w:jc w:val="center"/>
+            </w:pPr>
+          </w:p>
+        </w:tc>
+        <w:tc>
+          <w:tcPr>
+            <w:vMerge w:val="continue"/>
+            <w:vAlign w:val="center"/>
+          </w:tcPr>
+          <w:p>
+            <w:pPr>
+              <w:spacing w:before="0" w:after="0"/>
+              <w:jc w:val="center"/>
+            </w:pPr>
+          </w:p>
+        </w:tc>
+        <w:tc>
+          <w:tcPr>
+            <w:vMerge w:val="continue"/>
+            <w:vAlign w:val="center"/>
+          </w:tcPr>
+          <w:p>
+            <w:pPr>
+              <w:spacing w:before="0" w:after="0"/>
+              <w:jc w:val="center"/>
+            </w:pPr>
+          </w:p>
+        </w:tc>
+        <w:tc>
+          <w:tcPr>
+            <w:vMerge w:val="continue"/>
+            <w:vAlign w:val="center"/>
+          </w:tcPr>
+          <w:p>
+            <w:pPr>
+              <w:spacing w:before="0" w:after="0"/>
+              <w:jc w:val="center"/>
+            </w:pPr>
+          </w:p>
+        </w:tc>
+      </w:tr>
+      <w:tr>
+        <w:tc>
+          <w:p>
+            <w:pPr>
+              <w:spacing w:before="0" w:after="0"/>
+              <w:jc w:val="center"/>
+            </w:pPr>
+            <w:r>
+              <w:t xml:space="preserve">12</w:t>
             </w:r>
           </w:p>
         </w:tc>
@@ -1427,7 +1951,7 @@
               <w:jc w:val="center"/>
             </w:pPr>
             <w:r>
-              <w:t xml:space="preserve">Taxta</w:t>
+              <w:t xml:space="preserve">Krestik</w:t>
             </w:r>
           </w:p>
         </w:tc>
@@ -1606,7 +2130,7 @@
               <w:jc w:val="center"/>
             </w:pPr>
             <w:r>
-              <w:t xml:space="preserve">Krestik</w:t>
+              <w:t xml:space="preserve">Taxta</w:t>
             </w:r>
           </w:p>
         </w:tc>
@@ -1689,7 +2213,7 @@
               <w:jc w:val="center"/>
             </w:pPr>
             <w:r>
-              <w:t xml:space="preserve">Taxta</w:t>
+              <w:t xml:space="preserve">Krestik</w:t>
             </w:r>
           </w:p>
         </w:tc>
@@ -1705,10 +2229,6 @@
           </w:p>
         </w:tc>
         <w:tc>
-          <w:tcPr>
-            <w:vMerge w:val="restart"/>
-            <w:vAlign w:val="center"/>
-          </w:tcPr>
           <w:p>
             <w:pPr>
               <w:spacing w:before="0" w:after="0"/>
@@ -1721,10 +2241,6 @@
           </w:p>
         </w:tc>
         <w:tc>
-          <w:tcPr>
-            <w:vMerge w:val="restart"/>
-            <w:vAlign w:val="center"/>
-          </w:tcPr>
           <w:p>
             <w:pPr>
               <w:spacing w:before="0" w:after="0"/>
@@ -1736,10 +2252,6 @@
           </w:p>
         </w:tc>
         <w:tc>
-          <w:tcPr>
-            <w:vMerge w:val="restart"/>
-            <w:vAlign w:val="center"/>
-          </w:tcPr>
           <w:p>
             <w:pPr>
               <w:spacing w:before="0" w:after="0"/>
@@ -1751,10 +2263,6 @@
           </w:p>
         </w:tc>
         <w:tc>
-          <w:tcPr>
-            <w:vMerge w:val="restart"/>
-            <w:vAlign w:val="center"/>
-          </w:tcPr>
           <w:p>
             <w:pPr>
               <w:spacing w:before="0" w:after="0"/>
@@ -1785,7 +2293,7 @@
               <w:jc w:val="center"/>
             </w:pPr>
             <w:r>
-              <w:t xml:space="preserve">Oyoqlar</w:t>
+              <w:t xml:space="preserve">Taxta</w:t>
             </w:r>
           </w:p>
         </w:tc>
@@ -1802,50 +2310,63 @@
         </w:tc>
         <w:tc>
           <w:tcPr>
-            <w:vMerge w:val="continue"/>
-            <w:vAlign w:val="center"/>
-          </w:tcPr>
-          <w:p>
-            <w:pPr>
-              <w:spacing w:before="0" w:after="0"/>
-              <w:jc w:val="center"/>
-            </w:pPr>
-          </w:p>
-        </w:tc>
-        <w:tc>
-          <w:tcPr>
-            <w:vMerge w:val="continue"/>
-            <w:vAlign w:val="center"/>
-          </w:tcPr>
-          <w:p>
-            <w:pPr>
-              <w:spacing w:before="0" w:after="0"/>
-              <w:jc w:val="center"/>
-            </w:pPr>
-          </w:p>
-        </w:tc>
-        <w:tc>
-          <w:tcPr>
-            <w:vMerge w:val="continue"/>
-            <w:vAlign w:val="center"/>
-          </w:tcPr>
-          <w:p>
-            <w:pPr>
-              <w:spacing w:before="0" w:after="0"/>
-              <w:jc w:val="center"/>
-            </w:pPr>
-          </w:p>
-        </w:tc>
-        <w:tc>
-          <w:tcPr>
-            <w:vMerge w:val="continue"/>
-            <w:vAlign w:val="center"/>
-          </w:tcPr>
-          <w:p>
-            <w:pPr>
-              <w:spacing w:before="0" w:after="0"/>
-              <w:jc w:val="center"/>
-            </w:pPr>
+            <w:vMerge w:val="restart"/>
+            <w:vAlign w:val="center"/>
+          </w:tcPr>
+          <w:p>
+            <w:pPr>
+              <w:spacing w:before="0" w:after="0"/>
+              <w:jc w:val="center"/>
+            </w:pPr>
+            <w:r>
+              <w:t xml:space="preserve">Lesa kres
+5 ta</w:t>
+            </w:r>
+          </w:p>
+        </w:tc>
+        <w:tc>
+          <w:tcPr>
+            <w:vMerge w:val="restart"/>
+            <w:vAlign w:val="center"/>
+          </w:tcPr>
+          <w:p>
+            <w:pPr>
+              <w:spacing w:before="0" w:after="0"/>
+              <w:jc w:val="center"/>
+            </w:pPr>
+            <w:r>
+              <w:t xml:space="preserve">01-08-2025</w:t>
+            </w:r>
+          </w:p>
+        </w:tc>
+        <w:tc>
+          <w:tcPr>
+            <w:vMerge w:val="restart"/>
+            <w:vAlign w:val="center"/>
+          </w:tcPr>
+          <w:p>
+            <w:pPr>
+              <w:spacing w:before="0" w:after="0"/>
+              <w:jc w:val="center"/>
+            </w:pPr>
+            <w:r>
+              <w:t xml:space="preserve">4 kun</w:t>
+            </w:r>
+          </w:p>
+        </w:tc>
+        <w:tc>
+          <w:tcPr>
+            <w:vMerge w:val="restart"/>
+            <w:vAlign w:val="center"/>
+          </w:tcPr>
+          <w:p>
+            <w:pPr>
+              <w:spacing w:before="0" w:after="0"/>
+              <w:jc w:val="center"/>
+            </w:pPr>
+            <w:r>
+              <w:t xml:space="preserve">200 000 so'm</w:t>
+            </w:r>
           </w:p>
         </w:tc>
       </w:tr>
@@ -1868,7 +2389,7 @@
               <w:jc w:val="center"/>
             </w:pPr>
             <w:r>
-              <w:t xml:space="preserve">Krestik</w:t>
+              <w:t xml:space="preserve">Oyoqlar</w:t>
             </w:r>
           </w:p>
         </w:tc>
@@ -1951,7 +2472,90 @@
               <w:jc w:val="center"/>
             </w:pPr>
             <w:r>
-              <w:t xml:space="preserve">Taxta</w:t>
+              <w:t xml:space="preserve">Krestik</w:t>
+            </w:r>
+          </w:p>
+        </w:tc>
+        <w:tc>
+          <w:p>
+            <w:pPr>
+              <w:spacing w:before="0" w:after="0"/>
+              <w:jc w:val="center"/>
+            </w:pPr>
+            <w:r>
+              <w:t xml:space="preserve">10 ta</w:t>
+            </w:r>
+          </w:p>
+        </w:tc>
+        <w:tc>
+          <w:tcPr>
+            <w:vMerge w:val="continue"/>
+            <w:vAlign w:val="center"/>
+          </w:tcPr>
+          <w:p>
+            <w:pPr>
+              <w:spacing w:before="0" w:after="0"/>
+              <w:jc w:val="center"/>
+            </w:pPr>
+          </w:p>
+        </w:tc>
+        <w:tc>
+          <w:tcPr>
+            <w:vMerge w:val="continue"/>
+            <w:vAlign w:val="center"/>
+          </w:tcPr>
+          <w:p>
+            <w:pPr>
+              <w:spacing w:before="0" w:after="0"/>
+              <w:jc w:val="center"/>
+            </w:pPr>
+          </w:p>
+        </w:tc>
+        <w:tc>
+          <w:tcPr>
+            <w:vMerge w:val="continue"/>
+            <w:vAlign w:val="center"/>
+          </w:tcPr>
+          <w:p>
+            <w:pPr>
+              <w:spacing w:before="0" w:after="0"/>
+              <w:jc w:val="center"/>
+            </w:pPr>
+          </w:p>
+        </w:tc>
+        <w:tc>
+          <w:tcPr>
+            <w:vMerge w:val="continue"/>
+            <w:vAlign w:val="center"/>
+          </w:tcPr>
+          <w:p>
+            <w:pPr>
+              <w:spacing w:before="0" w:after="0"/>
+              <w:jc w:val="center"/>
+            </w:pPr>
+          </w:p>
+        </w:tc>
+      </w:tr>
+      <w:tr>
+        <w:tc>
+          <w:p>
+            <w:pPr>
+              <w:spacing w:before="0" w:after="0"/>
+              <w:jc w:val="center"/>
+            </w:pPr>
+            <w:r>
+              <w:t xml:space="preserve">8</w:t>
+            </w:r>
+          </w:p>
+        </w:tc>
+        <w:tc>
+          <w:p>
+            <w:pPr>
+              <w:spacing w:before="0" w:after="0"/>
+              <w:jc w:val="center"/>
+            </w:pPr>
+            <w:r>
+              <w:t xml:space="preserve">Oyoqlar</w:t>
             </w:r>
           </w:p>
         </w:tc>
@@ -1993,7 +2597,7 @@
               <w:jc w:val="center"/>
             </w:pPr>
             <w:r>
-              <w:t xml:space="preserve">01-08-2025</w:t>
+              <w:t xml:space="preserve">31-07-2025</w:t>
             </w:r>
           </w:p>
         </w:tc>
@@ -2008,7 +2612,7 @@
               <w:jc w:val="center"/>
             </w:pPr>
             <w:r>
-              <w:t xml:space="preserve">4 kun</w:t>
+              <w:t xml:space="preserve">3 kun</w:t>
             </w:r>
           </w:p>
         </w:tc>
@@ -2023,7 +2627,7 @@
               <w:jc w:val="center"/>
             </w:pPr>
             <w:r>
-              <w:t xml:space="preserve">200 000 so'm</w:t>
+              <w:t xml:space="preserve">150 000 so'm</w:t>
             </w:r>
           </w:p>
         </w:tc>
@@ -2036,89 +2640,6 @@
               <w:jc w:val="center"/>
             </w:pPr>
             <w:r>
-              <w:t xml:space="preserve">8</w:t>
-            </w:r>
-          </w:p>
-        </w:tc>
-        <w:tc>
-          <w:p>
-            <w:pPr>
-              <w:spacing w:before="0" w:after="0"/>
-              <w:jc w:val="center"/>
-            </w:pPr>
-            <w:r>
-              <w:t xml:space="preserve">Oyoqlar</w:t>
-            </w:r>
-          </w:p>
-        </w:tc>
-        <w:tc>
-          <w:p>
-            <w:pPr>
-              <w:spacing w:before="0" w:after="0"/>
-              <w:jc w:val="center"/>
-            </w:pPr>
-            <w:r>
-              <w:t xml:space="preserve">10 ta</w:t>
-            </w:r>
-          </w:p>
-        </w:tc>
-        <w:tc>
-          <w:tcPr>
-            <w:vMerge w:val="continue"/>
-            <w:vAlign w:val="center"/>
-          </w:tcPr>
-          <w:p>
-            <w:pPr>
-              <w:spacing w:before="0" w:after="0"/>
-              <w:jc w:val="center"/>
-            </w:pPr>
-          </w:p>
-        </w:tc>
-        <w:tc>
-          <w:tcPr>
-            <w:vMerge w:val="continue"/>
-            <w:vAlign w:val="center"/>
-          </w:tcPr>
-          <w:p>
-            <w:pPr>
-              <w:spacing w:before="0" w:after="0"/>
-              <w:jc w:val="center"/>
-            </w:pPr>
-          </w:p>
-        </w:tc>
-        <w:tc>
-          <w:tcPr>
-            <w:vMerge w:val="continue"/>
-            <w:vAlign w:val="center"/>
-          </w:tcPr>
-          <w:p>
-            <w:pPr>
-              <w:spacing w:before="0" w:after="0"/>
-              <w:jc w:val="center"/>
-            </w:pPr>
-          </w:p>
-        </w:tc>
-        <w:tc>
-          <w:tcPr>
-            <w:vMerge w:val="continue"/>
-            <w:vAlign w:val="center"/>
-          </w:tcPr>
-          <w:p>
-            <w:pPr>
-              <w:spacing w:before="0" w:after="0"/>
-              <w:jc w:val="center"/>
-            </w:pPr>
-          </w:p>
-        </w:tc>
-      </w:tr>
-      <w:tr>
-        <w:tc>
-          <w:p>
-            <w:pPr>
-              <w:spacing w:before="0" w:after="0"/>
-              <w:jc w:val="center"/>
-            </w:pPr>
-            <w:r>
               <w:t xml:space="preserve">9</w:t>
             </w:r>
           </w:p>
@@ -2130,7 +2651,7 @@
               <w:jc w:val="center"/>
             </w:pPr>
             <w:r>
-              <w:t xml:space="preserve">Krestik</w:t>
+              <w:t xml:space="preserve">Taxta</w:t>
             </w:r>
           </w:p>
         </w:tc>
@@ -2384,15 +2905,156 @@
       </w:tr>
       <w:tr>
         <w:tc>
-          <w:tcPr>
-            <w:gridSpan w:val="5"/>
-          </w:tcPr>
-          <w:p>
-            <w:pPr>
-              <w:jc w:val="center"/>
-            </w:pPr>
-            <w:r>
-              <w:t xml:space="preserve">Ma'lumot yo'q</w:t>
+          <w:p>
+            <w:pPr>
+              <w:jc w:val="center"/>
+            </w:pPr>
+            <w:r>
+              <w:t xml:space="preserve">1</w:t>
+            </w:r>
+          </w:p>
+        </w:tc>
+        <w:tc>
+          <w:p>
+            <w:pPr>
+              <w:jc w:val="center"/>
+            </w:pPr>
+            <w:r>
+              <w:t xml:space="preserve">Taxta</w:t>
+            </w:r>
+          </w:p>
+        </w:tc>
+        <w:tc>
+          <w:p>
+            <w:pPr>
+              <w:jc w:val="center"/>
+            </w:pPr>
+            <w:r>
+              <w:t xml:space="preserve">40 ta</w:t>
+            </w:r>
+          </w:p>
+        </w:tc>
+        <w:tc>
+          <w:p>
+            <w:pPr>
+              <w:jc w:val="center"/>
+            </w:pPr>
+            <w:r>
+              <w:t xml:space="preserve">75 000 so'm</w:t>
+            </w:r>
+          </w:p>
+        </w:tc>
+        <w:tc>
+          <w:p>
+            <w:pPr>
+              <w:jc w:val="center"/>
+            </w:pPr>
+            <w:r>
+              <w:t xml:space="preserve">3 000 000 so'm</w:t>
+            </w:r>
+          </w:p>
+        </w:tc>
+      </w:tr>
+      <w:tr>
+        <w:tc>
+          <w:p>
+            <w:pPr>
+              <w:jc w:val="center"/>
+            </w:pPr>
+            <w:r>
+              <w:t xml:space="preserve">2</w:t>
+            </w:r>
+          </w:p>
+        </w:tc>
+        <w:tc>
+          <w:p>
+            <w:pPr>
+              <w:jc w:val="center"/>
+            </w:pPr>
+            <w:r>
+              <w:t xml:space="preserve">Oyoqlar</w:t>
+            </w:r>
+          </w:p>
+        </w:tc>
+        <w:tc>
+          <w:p>
+            <w:pPr>
+              <w:jc w:val="center"/>
+            </w:pPr>
+            <w:r>
+              <w:t xml:space="preserve">40 ta</w:t>
+            </w:r>
+          </w:p>
+        </w:tc>
+        <w:tc>
+          <w:p>
+            <w:pPr>
+              <w:jc w:val="center"/>
+            </w:pPr>
+            <w:r>
+              <w:t xml:space="preserve">95 000 so'm</w:t>
+            </w:r>
+          </w:p>
+        </w:tc>
+        <w:tc>
+          <w:p>
+            <w:pPr>
+              <w:jc w:val="center"/>
+            </w:pPr>
+            <w:r>
+              <w:t xml:space="preserve">3 800 000 so'm</w:t>
+            </w:r>
+          </w:p>
+        </w:tc>
+      </w:tr>
+      <w:tr>
+        <w:tc>
+          <w:p>
+            <w:pPr>
+              <w:jc w:val="center"/>
+            </w:pPr>
+            <w:r>
+              <w:t xml:space="preserve">3</w:t>
+            </w:r>
+          </w:p>
+        </w:tc>
+        <w:tc>
+          <w:p>
+            <w:pPr>
+              <w:jc w:val="center"/>
+            </w:pPr>
+            <w:r>
+              <w:t xml:space="preserve">Krestik</w:t>
+            </w:r>
+          </w:p>
+        </w:tc>
+        <w:tc>
+          <w:p>
+            <w:pPr>
+              <w:jc w:val="center"/>
+            </w:pPr>
+            <w:r>
+              <w:t xml:space="preserve">40 ta</w:t>
+            </w:r>
+          </w:p>
+        </w:tc>
+        <w:tc>
+          <w:p>
+            <w:pPr>
+              <w:jc w:val="center"/>
+            </w:pPr>
+            <w:r>
+              <w:t xml:space="preserve">95 000 so'm</w:t>
+            </w:r>
+          </w:p>
+        </w:tc>
+        <w:tc>
+          <w:p>
+            <w:pPr>
+              <w:jc w:val="center"/>
+            </w:pPr>
+            <w:r>
+              <w:t xml:space="preserve">3 800 000 so'm</w:t>
             </w:r>
           </w:p>
         </w:tc>
@@ -2539,16 +3201,126 @@
       </w:tr>
       <w:tr>
         <w:tc>
-          <w:tcPr>
-            <w:gridSpan w:val="3"/>
-          </w:tcPr>
-          <w:p>
-            <w:pPr>
-              <w:jc w:val="center"/>
-            </w:pPr>
-            <w:r>
-              <w:t xml:space="preserve">Ma'lumot yo'q</w:t>
-            </w:r>
+          <w:p>
+            <w:pPr>
+              <w:jc w:val="center"/>
+            </w:pPr>
+            <w:r>
+              <w:t xml:space="preserve">500 000 so'm</w:t>
+            </w:r>
+          </w:p>
+        </w:tc>
+        <w:tc>
+          <w:p>
+            <w:pPr>
+              <w:jc w:val="center"/>
+            </w:pPr>
+            <w:r>
+              <w:t xml:space="preserve">Naxt</w:t>
+            </w:r>
+          </w:p>
+        </w:tc>
+        <w:tc>
+          <w:p>
+            <w:pPr>
+              <w:jc w:val="center"/>
+            </w:pPr>
+            <w:r>
+              <w:t xml:space="preserve">29-07-2025</w:t>
+            </w:r>
+          </w:p>
+        </w:tc>
+      </w:tr>
+      <w:tr>
+        <w:tc>
+          <w:p>
+            <w:pPr>
+              <w:jc w:val="center"/>
+            </w:pPr>
+            <w:r>
+              <w:t xml:space="preserve">30 000 so'm</w:t>
+            </w:r>
+          </w:p>
+        </w:tc>
+        <w:tc>
+          <w:p>
+            <w:pPr>
+              <w:jc w:val="center"/>
+            </w:pPr>
+            <w:r>
+              <w:t xml:space="preserve">Naxt</w:t>
+            </w:r>
+          </w:p>
+        </w:tc>
+        <w:tc>
+          <w:p>
+            <w:pPr>
+              <w:jc w:val="center"/>
+            </w:pPr>
+            <w:r>
+              <w:t xml:space="preserve">28-07-2025</w:t>
+            </w:r>
+          </w:p>
+        </w:tc>
+      </w:tr>
+      <w:tr>
+        <w:tc>
+          <w:p>
+            <w:pPr>
+              <w:jc w:val="center"/>
+            </w:pPr>
+            <w:r>
+              <w:t xml:space="preserve">65 000 so'm</w:t>
+            </w:r>
+          </w:p>
+        </w:tc>
+        <w:tc>
+          <w:p>
+            <w:pPr>
+              <w:jc w:val="center"/>
+            </w:pPr>
+            <w:r>
+              <w:t xml:space="preserve">Naxt</w:t>
+            </w:r>
+          </w:p>
+        </w:tc>
+        <w:tc>
+          <w:p>
+            <w:pPr>
+              <w:jc w:val="center"/>
+            </w:pPr>
+            <w:r>
+              <w:t xml:space="preserve">28-07-2025</w:t>
+            </w:r>
+          </w:p>
+        </w:tc>
+      </w:tr>
+      <w:tr>
+        <w:tc>
+          <w:p>
+            <w:pPr>
+              <w:jc w:val="center"/>
+            </w:pPr>
+            <w:r>
+              <w:t xml:space="preserve">595 000 so'm</w:t>
+            </w:r>
+          </w:p>
+        </w:tc>
+        <w:tc>
+          <w:p>
+            <w:pPr>
+              <w:jc w:val="center"/>
+            </w:pPr>
+            <w:r>
+              <w:t xml:space="preserve">Jami</w:t>
+            </w:r>
+          </w:p>
+        </w:tc>
+        <w:tc>
+          <w:p>
+            <w:pPr>
+              <w:jc w:val="center"/>
+            </w:pPr>
           </w:p>
         </w:tc>
       </w:tr>
@@ -2647,7 +3419,7 @@
                 <w:szCs w:val="24"/>
                 <w:rFonts w:ascii="Times New Roman" w:cs="Times New Roman" w:eastAsia="Times New Roman" w:hAnsi="Times New Roman"/>
               </w:rPr>
-              <w:t xml:space="preserve">0</w:t>
+              <w:t xml:space="preserve">595 000</w:t>
             </w:r>
             <w:r>
               <w:t xml:space="preserve"> so'm</w:t>
@@ -2733,7 +3505,7 @@
                 <w:szCs w:val="24"/>
                 <w:rFonts w:ascii="Times New Roman" w:cs="Times New Roman" w:eastAsia="Times New Roman" w:hAnsi="Times New Roman"/>
               </w:rPr>
-              <w:t xml:space="preserve">0</w:t>
+              <w:t xml:space="preserve">60 000</w:t>
             </w:r>
             <w:r>
               <w:t xml:space="preserve"> so'm</w:t>
@@ -2812,7 +3584,7 @@
                 <w:szCs w:val="24"/>
                 <w:rFonts w:ascii="Times New Roman" w:cs="Times New Roman" w:eastAsia="Times New Roman" w:hAnsi="Times New Roman"/>
               </w:rPr>
-              <w:t xml:space="preserve">0</w:t>
+              <w:t xml:space="preserve">10 600 000</w:t>
             </w:r>
             <w:r>
               <w:t xml:space="preserve"> so'm</w:t>
@@ -2890,7 +3662,7 @@
                 <w:szCs w:val="24"/>
                 <w:rFonts w:ascii="Times New Roman" w:cs="Times New Roman" w:eastAsia="Times New Roman" w:hAnsi="Times New Roman"/>
               </w:rPr>
-              <w:t xml:space="preserve">450 000</w:t>
+              <w:t xml:space="preserve">165 000</w:t>
             </w:r>
             <w:r>
               <w:t xml:space="preserve"> so'm</w:t>
@@ -2976,7 +3748,7 @@
                 <w:szCs w:val="24"/>
                 <w:rFonts w:ascii="Times New Roman" w:cs="Times New Roman" w:eastAsia="Times New Roman" w:hAnsi="Times New Roman"/>
               </w:rPr>
-              <w:t xml:space="preserve">0</w:t>
+              <w:t xml:space="preserve">10 705 000</w:t>
             </w:r>
             <w:r>
               <w:t xml:space="preserve"> so'm</w:t>

</xml_diff>